<commit_message>
paper-zh-journal-ids: add DeepSeek model generalization to F1/F2
Add deepseek-v4-flash as a second API-model control in the F1
false-heal table and §3.3/§5 discussion, and replicate the F2 2x2
factorial on DeepSeek. The F2 replication shows only the strong-anchor
post-filter keeps a zero-regression gain across models, while testId
weighting is a net-zero churn; the paper now frames the deterministic
levers as model-dependent engineering evidence. Synchronize the Word
deliverable (F1 table, factorial table, discussion paragraphs) and keep
red revisions intact.

Co-Authored-By: Claude Code <noreply@anthropic.com>
</commit_message>
<xml_diff>
--- a/paper-zh-journal-ids/Playwright 测试自愈隐性误修复实证研究.docx
+++ b/paper-zh-journal-ids/Playwright 测试自愈隐性误修复实证研究.docx
@@ -38,154 +38,7 @@
         <w:rPr>
           <w:rFonts w:hint="eastAsia"/>
         </w:rPr>
-        <w:t xml:space="preserve">为降低</w:t>
-      </w:r>
-      <w:r>
-        <w:t xml:space="preserve"> Playwright </w:t>
-      </w:r>
-      <w:r>
-        <w:rPr>
-          <w:rFonts w:hint="eastAsia"/>
-        </w:rPr>
-        <w:t xml:space="preserve">测试中脆弱定位器维护成本，本文研究大语言模型（Large</w:t>
-      </w:r>
-      <w:r>
-        <w:t xml:space="preserve"> Language </w:t>
-      </w:r>
-      <w:r>
-        <w:rPr>
-          <w:rFonts w:hint="eastAsia"/>
-        </w:rPr>
-        <w:t xml:space="preserve">Model，LLM）驱动的测试自愈是否产生隐性误修复。以</w:t>
-      </w:r>
-      <w:r>
-        <w:t xml:space="preserve"> ReproBreak </w:t>
-      </w:r>
-      <w:r>
-        <w:rPr>
-          <w:rFonts w:hint="eastAsia"/>
-        </w:rPr>
-        <w:t xml:space="preserve">数据集</w:t>
-      </w:r>
-      <w:r>
-        <w:t xml:space="preserve"> koenig </w:t>
-      </w:r>
-      <w:r>
-        <w:rPr>
-          <w:rFonts w:hint="eastAsia"/>
-        </w:rPr>
-        <w:t xml:space="preserve">项目</w:t>
-      </w:r>
-      <w:r>
-        <w:t xml:space="preserve"> 75 </w:t>
-      </w:r>
-      <w:r>
-        <w:rPr>
-          <w:rFonts w:hint="eastAsia"/>
-        </w:rPr>
-        <w:t xml:space="preserve">个真实可达失效用例为对象，本文在选择器解析层面对</w:t>
-      </w:r>
-      <w:r>
-        <w:t xml:space="preserve"> LLM </w:t>
-      </w:r>
-      <w:r>
-        <w:rPr>
-          <w:rFonts w:hint="eastAsia"/>
-        </w:rPr>
-        <w:t xml:space="preserve">修复器进行对抗性诊断，并以</w:t>
-      </w:r>
-      <w:r>
-        <w:t xml:space="preserve"> HealReact </w:t>
-      </w:r>
-      <w:r>
-        <w:rPr>
-          <w:rFonts w:hint="eastAsia"/>
-        </w:rPr>
-        <w:t xml:space="preserve">的</w:t>
-      </w:r>
-      <w:r>
-        <w:t xml:space="preserve"> L1/L3 </w:t>
-      </w:r>
-      <w:r>
-        <w:rPr>
-          <w:rFonts w:hint="eastAsia"/>
-        </w:rPr>
-        <w:t xml:space="preserve">静态基底作为可复现测量平台。结果表明，目标元素被移除时，</w:t>
-      </w:r>
-      <w:r>
-        <w:rPr>
-          <w:rStyle w:val="VerbatimChar"/>
-        </w:rPr>
-        <w:t xml:space="preserve">qwen2.5-coder:7b</w:t>
-      </w:r>
-      <w:r>
-        <w:t xml:space="preserve"> </w:t>
-      </w:r>
-      <w:r>
-        <w:rPr>
-          <w:rFonts w:hint="eastAsia"/>
-        </w:rPr>
-        <w:t xml:space="preserve">在</w:t>
-      </w:r>
-      <w:r>
-        <w:t xml:space="preserve"> 78.7% </w:t>
-      </w:r>
-      <w:r>
-        <w:rPr>
-          <w:rFonts w:hint="eastAsia"/>
-        </w:rPr>
-        <w:t xml:space="preserve">的用例中生成指向错误元素的可解析选择器，显式放弃提示未改变逐用例判定；</w:t>
-      </w:r>
-      <w:r>
-        <w:rPr>
-          <w:rStyle w:val="VerbatimChar"/>
-        </w:rPr>
-        <w:t xml:space="preserve">gpt-4o</w:t>
-      </w:r>
-      <w:r>
-        <w:t xml:space="preserve"> </w:t>
-      </w:r>
-      <w:r>
-        <w:rPr>
-          <w:rFonts w:hint="eastAsia"/>
-        </w:rPr>
-        <w:t xml:space="preserve">在同一协议下由</w:t>
-      </w:r>
-      <w:r>
-        <w:t xml:space="preserve"> 84.0% </w:t>
-      </w:r>
-      <w:r>
-        <w:rPr>
-          <w:rFonts w:hint="eastAsia"/>
-        </w:rPr>
-        <w:t xml:space="preserve">降至</w:t>
-      </w:r>
-      <w:r>
-        <w:t xml:space="preserve"> </w:t>
-      </w:r>
-      <w:r>
-        <w:rPr>
-          <w:rFonts w:hint="eastAsia"/>
-        </w:rPr>
-        <w:t xml:space="preserve">68.0%，但仍保留高比例误修复。静态基底覆盖</w:t>
-      </w:r>
-      <w:r>
-        <w:t xml:space="preserve"> 80.6% </w:t>
-      </w:r>
-      <w:r>
-        <w:rPr>
-          <w:rFonts w:hint="eastAsia"/>
-        </w:rPr>
-        <w:t xml:space="preserve">的真实失效目标，但该数字不等同于真实</w:t>
-      </w:r>
-      <w:r>
-        <w:t xml:space="preserve"> Playwright </w:t>
-      </w:r>
-      <w:r>
-        <w:rPr>
-          <w:rFonts w:hint="eastAsia"/>
-        </w:rPr>
-        <w:t xml:space="preserve">运行时通过率。研究认为，无人值守持续集成自愈需要行为重放验证器。</w:t>
+        <w:t xml:space="preserve">为降低 Playwright 脆弱定位器的维护成本，本文研究大语言模型（Large Language Model，LLM）驱动的测试自愈是否产生隐性误修复。以 ReproBreak 数据集 koenig 项目 75 个真实可达失效用例为对象，在选择器解析层面诊断 LLM 修复器，并以 HealReact 的 L1/L3 静态基底作为可复现测量平台。结果表明，目标元素被移除时，qwen2.5-coder:7b 在 78.7% 的用例中生成指向错误元素的可解析选择器，显式放弃提示未改变逐用例判定；gpt-4o 与 deepseek-v4-flash 分别由 84.0% 降至 68.0%、由 80.0% 降至 70.7%，但仍保留高比例误修复。静态基底覆盖 80.6% 的真实失效目标，但不等同于运行时通过率。研究认为，无人值守持续集成自愈需要行为重放验证器。</w:t>
       </w:r>
     </w:p>
     <w:p>
@@ -278,13 +131,13 @@
         <w:rPr>
           <w:rStyle w:val="VerbatimChar"/>
         </w:rPr>
-        <w:t xml:space="preserve">gpt-4o</w:t>
-      </w:r>
-      <w:r>
-        <w:t xml:space="preserve"> </w:t>
-      </w:r>
-      <w:r>
-        <w:t xml:space="preserve">decreases the rate from 84.0% to 68.0%, but still leaves many false heals. The static substrate covers 80.6% of real break targets, but this number is not a real Playwright runtime pass rate. The study concludes that unattended continuous integration self-healing requires a behavioral replay verifier.</w:t>
+        <w:t xml:space="preserve">gpt-4o and deepseek-v4-flash</w:t>
+      </w:r>
+      <w:r>
+        <w:t xml:space="preserve"> </w:t>
+      </w:r>
+      <w:r>
+        <w:t xml:space="preserve">decrease the rate from 84.0% to 68.0% and from 80.0% to 70.7%, respectively, but both still leave many false heals. The static substrate covers 80.6% of real break targets, but this number is not a real Playwright runtime pass rate. The study concludes that unattended continuous integration self-healing requires a behavioral replay verifier.</w:t>
       </w:r>
     </w:p>
     <w:p>
@@ -743,16 +596,16 @@
         <w:rPr>
           <w:rStyle w:val="VerbatimChar"/>
         </w:rPr>
-        <w:t xml:space="preserve">gpt-4o</w:t>
-      </w:r>
-      <w:r>
-        <w:t xml:space="preserve"> </w:t>
-      </w:r>
-      <w:r>
-        <w:rPr>
-          <w:rFonts w:hint="eastAsia"/>
-        </w:rPr>
-        <w:t xml:space="preserve">对照：其误修复率从</w:t>
+        <w:t xml:space="preserve">gpt-4o 与 deepseek-v4-flash</w:t>
+      </w:r>
+      <w:r>
+        <w:t xml:space="preserve"> </w:t>
+      </w:r>
+      <w:r>
+        <w:rPr>
+          <w:rFonts w:hint="eastAsia"/>
+        </w:rPr>
+        <w:t xml:space="preserve">对照：前者从</w:t>
       </w:r>
       <w:r>
         <w:t xml:space="preserve"> Vanilla </w:t>
@@ -788,7 +641,7 @@
         <w:rPr>
           <w:rFonts w:hint="eastAsia"/>
         </w:rPr>
-        <w:t xml:space="preserve">68.0%（51/75），但仍有多数用例会被静默改写到错误元素。</w:t>
+        <w:t xml:space="preserve">68.0%（51/75），后者从 80.0%（60/75）降至 70.7%（53/75），但仍有多数用例会被静默改写到错误元素。</w:t>
       </w:r>
     </w:p>
     <w:p>
@@ -811,7 +664,7 @@
           <w:b/>
           <w:bCs/>
         </w:rPr>
-        <w:t xml:space="preserve">两个低开销确定性杠杆带来零回归的局部改进。</w:t>
+        <w:t xml:space="preserve">低开销确定性杠杆带来零回归的局部改进，但收益构成依赖模型。</w:t>
       </w:r>
       <w:r>
         <w:t xml:space="preserve">HealReact </w:t>
@@ -1191,7 +1044,7 @@
         <w:rPr>
           <w:rFonts w:hint="eastAsia"/>
         </w:rPr>
-        <w:t xml:space="preserve">）。两个低开销确定性杠杆</w:t>
+        <w:t xml:space="preserve">）。两个低开销确定性杠杆在 Qwen 上</w:t>
       </w:r>
       <w:r>
         <w:t xml:space="preserve"> —— testId </w:t>
@@ -1244,7 +1097,7 @@
         <w:pStyle w:val="FirstParagraph"/>
       </w:pPr>
       <w:r>
-        <w:t xml:space="preserve">（i）在真实 Playwright 数据集上对隐性误修复进行选择器层面的诊断性测量，并展示软提示放弃指令在本地 7B 模型上逐用例无效、在 gpt-4o 上仍留下高比例误修复（§3）； （ii）使用 HealReact 的 L1/L3 静态基底作为可复现测量平台，而非声称已实现完整 L1–L4 自愈系统（§2）； （iii）给出两个辅助性工程观察：低开销确定性杠杆可带来零回归的局部改进但统计未显著，跨应用可达率受锚点文化差异显著制约（§3）。</w:t>
+        <w:t xml:space="preserve">（i）在真实 Playwright 数据集上对隐性误修复进行选择器层面的诊断性测量，并展示软提示放弃指令在本地 7B 模型上逐用例无效、在 gpt-4o 与 deepseek-v4-flash 上仍留下高比例误修复（§3）； （ii）使用 HealReact 的 L1/L3 静态基底作为可复现测量平台，而非声称已实现完整 L1–L4 自愈系统（§2）； （iii）给出两个辅助性工程观察：低开销确定性杠杆可带来零回归的局部改进但统计未显著，跨应用可达率受锚点文化差异显著制约（§3）。</w:t>
       </w:r>
     </w:p>
     <w:p>
@@ -2692,7 +2545,7 @@
         <w:rPr>
           <w:rStyle w:val="VerbatimChar"/>
         </w:rPr>
-        <w:t xml:space="preserve">gpt-4o</w:t>
+        <w:t xml:space="preserve">gpt-4o 与 deepseek-v4-flash</w:t>
       </w:r>
       <w:r>
         <w:t xml:space="preserve"> </w:t>
@@ -2902,13 +2755,13 @@
         <w:rPr>
           <w:rFonts w:hint="eastAsia"/>
         </w:rPr>
-        <w:t xml:space="preserve">协议上加入一个前沿闭源模型对照（</w:t>
+        <w:t xml:space="preserve">协议上加入两个 API 模型对照（</w:t>
       </w:r>
       <w:r>
         <w:rPr>
           <w:rStyle w:val="VerbatimChar"/>
         </w:rPr>
-        <w:t xml:space="preserve">gpt-4o</w:t>
+        <w:t xml:space="preserve">gpt-4o 与 deepseek-v4-flash</w:t>
       </w:r>
       <w:r>
         <w:rPr>
@@ -2956,7 +2809,7 @@
         <w:t xml:space="preserve">=0，单次采样；正式工件使用</w:t>
       </w:r>
       <w:r>
-        <w:t xml:space="preserve"> 2 s </w:t>
+        <w:t xml:space="preserve"> 2 s（GPT-4o）与 0.5 s（DeepSeek） </w:t>
       </w:r>
       <w:r>
         <w:rPr>
@@ -2971,7 +2824,7 @@
         <w:rPr>
           <w:rFonts w:hint="eastAsia"/>
         </w:rPr>
-        <w:t xml:space="preserve">退避重试，最终错误数为</w:t>
+        <w:t xml:space="preserve">退避重试，最终错误数均为</w:t>
       </w:r>
       <w:r>
         <w:t xml:space="preserve"> </w:t>
@@ -3209,7 +3062,7 @@
         <w:rPr>
           <w:rFonts w:hint="eastAsia"/>
         </w:rPr>
-        <w:t xml:space="preserve">；F1</w:t>
+        <w:t xml:space="preserve">；F1 与 F2</w:t>
       </w:r>
       <w:r>
         <w:t xml:space="preserve"> </w:t>
@@ -3227,7 +3080,7 @@
         <w:rPr>
           <w:rStyle w:val="VerbatimChar"/>
         </w:rPr>
-        <w:t xml:space="preserve">gpt-4o</w:t>
+        <w:t xml:space="preserve">gpt-4o 或 deepseek-v4-flash</w:t>
       </w:r>
       <w:r>
         <w:rPr>
@@ -3721,108 +3574,717 @@
     </w:p>
     <w:p>
       <w:pPr>
+        <w:pStyle w:val="TableCaption"/>
+      </w:pPr>
+      <w:r>
+        <w:rPr>
+          <w:rFonts w:hint="eastAsia"/>
+        </w:rPr>
+        <w:t xml:space="preserve">表 1 误修复探针（§3.3）。所有模型均使用相同的 75 个可达 koenig 用例与相同的 ground-truth 移除协议。</w:t>
+      </w:r>
+    </w:p>
+    <w:tbl>
+      <w:tblPr>
+        <w:tblStyle w:val="Table"/>
+        <w:tblW w:type="auto" w:w="0"/>
+        <w:tblLook w:firstRow="1" w:lastRow="0" w:firstColumn="0" w:lastColumn="0" w:noHBand="0" w:noVBand="0" w:val="0020"/>
+        <w:tblCaption w:val="表 1 误修复探针（§3.3）。所有模型均使用相同的 75 个可达 koenig 用例与相同的 ground-truth 移除协议。"/>
+      </w:tblPr>
+      <w:tblGrid>
+        <w:gridCol w:w="2300"/>
+        <w:gridCol w:w="2200"/>
+        <w:gridCol w:w="1300"/>
+        <w:gridCol w:w="1400"/>
+        <w:gridCol w:w="1200"/>
+        <w:gridCol w:w="1500"/>
+      </w:tblGrid>
+      <w:tr>
+        <w:trPr>
+          <w:tblHeader w:val="on"/>
+        </w:trPr>
+        <w:tc>
+          <w:tcPr/>
+          <w:p>
+            <w:pPr>
+              <w:pStyle w:val="Compact"/>
+              <w:jc w:val="left"/>
+            </w:pPr>
+            <w:r>
+              <w:rPr>
+                <w:b/>
+                <w:bCs/>
+                <w:rFonts w:hint="eastAsia"/>
+              </w:rPr>
+              <w:t xml:space="preserve">模型</w:t>
+            </w:r>
+          </w:p>
+        </w:tc>
+        <w:tc>
+          <w:tcPr/>
+          <w:p>
+            <w:pPr>
+              <w:pStyle w:val="Compact"/>
+              <w:jc w:val="left"/>
+            </w:pPr>
+            <w:r>
+              <w:rPr>
+                <w:b/>
+                <w:bCs/>
+                <w:rFonts w:hint="eastAsia"/>
+              </w:rPr>
+              <w:t xml:space="preserve">prompt</w:t>
+            </w:r>
+          </w:p>
+        </w:tc>
+        <w:tc>
+          <w:tcPr/>
+          <w:p>
+            <w:pPr>
+              <w:pStyle w:val="Compact"/>
+              <w:jc w:val="right"/>
+            </w:pPr>
+            <w:r>
+              <w:rPr>
+                <w:b/>
+                <w:bCs/>
+                <w:rFonts w:hint="eastAsia"/>
+              </w:rPr>
+              <w:t xml:space="preserve">放弃 (好)</w:t>
+            </w:r>
+          </w:p>
+        </w:tc>
+        <w:tc>
+          <w:tcPr/>
+          <w:p>
+            <w:pPr>
+              <w:pStyle w:val="Compact"/>
+              <w:jc w:val="right"/>
+            </w:pPr>
+            <w:r>
+              <w:rPr>
+                <w:b/>
+                <w:bCs/>
+                <w:rFonts w:hint="eastAsia"/>
+              </w:rPr>
+              <w:t xml:space="preserve">误修复 (坏)</w:t>
+            </w:r>
+          </w:p>
+        </w:tc>
+        <w:tc>
+          <w:tcPr/>
+          <w:p>
+            <w:pPr>
+              <w:pStyle w:val="Compact"/>
+              <w:jc w:val="right"/>
+            </w:pPr>
+            <w:r>
+              <w:rPr>
+                <w:b/>
+                <w:bCs/>
+                <w:rFonts w:hint="eastAsia"/>
+              </w:rPr>
+              <w:t xml:space="preserve">未解析</w:t>
+            </w:r>
+          </w:p>
+        </w:tc>
+        <w:tc>
+          <w:tcPr/>
+          <w:p>
+            <w:pPr>
+              <w:pStyle w:val="Compact"/>
+              <w:jc w:val="right"/>
+            </w:pPr>
+            <w:r>
+              <w:rPr>
+                <w:b/>
+                <w:bCs/>
+                <w:rFonts w:hint="eastAsia"/>
+              </w:rPr>
+              <w:t xml:space="preserve">误修复 %</w:t>
+            </w:r>
+          </w:p>
+        </w:tc>
+      </w:tr>
+      <w:tr>
+        <w:tc>
+          <w:tcPr/>
+          <w:p>
+            <w:pPr>
+              <w:pStyle w:val="Compact"/>
+              <w:jc w:val="left"/>
+            </w:pPr>
+            <w:r>
+              <w:rPr>
+                <w:rStyle w:val="VerbatimChar"/>
+                <w:rFonts w:hint="eastAsia"/>
+              </w:rPr>
+              <w:t xml:space="preserve">qwen2.5-coder:7b</w:t>
+            </w:r>
+          </w:p>
+        </w:tc>
+        <w:tc>
+          <w:tcPr/>
+          <w:p>
+            <w:pPr>
+              <w:pStyle w:val="Compact"/>
+              <w:jc w:val="left"/>
+            </w:pPr>
+            <w:r>
+              <w:rPr>
+                <w:rFonts w:hint="eastAsia"/>
+              </w:rPr>
+              <w:t xml:space="preserve">Vanilla</w:t>
+            </w:r>
+          </w:p>
+        </w:tc>
+        <w:tc>
+          <w:tcPr/>
+          <w:p>
+            <w:pPr>
+              <w:pStyle w:val="Compact"/>
+              <w:jc w:val="right"/>
+            </w:pPr>
+            <w:r>
+              <w:rPr>
+                <w:rFonts w:hint="eastAsia"/>
+              </w:rPr>
+              <w:t xml:space="preserve">13</w:t>
+            </w:r>
+          </w:p>
+        </w:tc>
+        <w:tc>
+          <w:tcPr/>
+          <w:p>
+            <w:pPr>
+              <w:pStyle w:val="Compact"/>
+              <w:jc w:val="right"/>
+            </w:pPr>
+            <w:r>
+              <w:rPr>
+                <w:rFonts w:hint="eastAsia"/>
+              </w:rPr>
+              <w:t xml:space="preserve">59</w:t>
+            </w:r>
+          </w:p>
+        </w:tc>
+        <w:tc>
+          <w:tcPr/>
+          <w:p>
+            <w:pPr>
+              <w:pStyle w:val="Compact"/>
+              <w:jc w:val="right"/>
+            </w:pPr>
+            <w:r>
+              <w:rPr>
+                <w:rFonts w:hint="eastAsia"/>
+              </w:rPr>
+              <w:t xml:space="preserve">3</w:t>
+            </w:r>
+          </w:p>
+        </w:tc>
+        <w:tc>
+          <w:tcPr/>
+          <w:p>
+            <w:pPr>
+              <w:pStyle w:val="Compact"/>
+              <w:jc w:val="right"/>
+            </w:pPr>
+            <w:r>
+              <w:rPr>
+                <w:b/>
+                <w:bCs/>
+                <w:rFonts w:hint="eastAsia"/>
+              </w:rPr>
+              <w:t xml:space="preserve">78.7%</w:t>
+            </w:r>
+          </w:p>
+        </w:tc>
+      </w:tr>
+      <w:tr>
+        <w:tc>
+          <w:tcPr/>
+          <w:p>
+            <w:pPr>
+              <w:pStyle w:val="Compact"/>
+              <w:jc w:val="left"/>
+            </w:pPr>
+            <w:r>
+              <w:rPr>
+                <w:rStyle w:val="VerbatimChar"/>
+                <w:rFonts w:hint="eastAsia"/>
+              </w:rPr>
+              <w:t xml:space="preserve">qwen2.5-coder:7b</w:t>
+            </w:r>
+          </w:p>
+        </w:tc>
+        <w:tc>
+          <w:tcPr/>
+          <w:p>
+            <w:pPr>
+              <w:pStyle w:val="Compact"/>
+              <w:jc w:val="left"/>
+            </w:pPr>
+            <w:r>
+              <w:rPr>
+                <w:rFonts w:hint="eastAsia"/>
+              </w:rPr>
+              <w:t xml:space="preserve">+ 放弃守门规则</w:t>
+            </w:r>
+          </w:p>
+        </w:tc>
+        <w:tc>
+          <w:tcPr/>
+          <w:p>
+            <w:pPr>
+              <w:pStyle w:val="Compact"/>
+              <w:jc w:val="right"/>
+            </w:pPr>
+            <w:r>
+              <w:rPr>
+                <w:rFonts w:hint="eastAsia"/>
+              </w:rPr>
+              <w:t xml:space="preserve">13</w:t>
+            </w:r>
+          </w:p>
+        </w:tc>
+        <w:tc>
+          <w:tcPr/>
+          <w:p>
+            <w:pPr>
+              <w:pStyle w:val="Compact"/>
+              <w:jc w:val="right"/>
+            </w:pPr>
+            <w:r>
+              <w:rPr>
+                <w:rFonts w:hint="eastAsia"/>
+              </w:rPr>
+              <w:t xml:space="preserve">59</w:t>
+            </w:r>
+          </w:p>
+        </w:tc>
+        <w:tc>
+          <w:tcPr/>
+          <w:p>
+            <w:pPr>
+              <w:pStyle w:val="Compact"/>
+              <w:jc w:val="right"/>
+            </w:pPr>
+            <w:r>
+              <w:rPr>
+                <w:rFonts w:hint="eastAsia"/>
+              </w:rPr>
+              <w:t xml:space="preserve">3</w:t>
+            </w:r>
+          </w:p>
+        </w:tc>
+        <w:tc>
+          <w:tcPr/>
+          <w:p>
+            <w:pPr>
+              <w:pStyle w:val="Compact"/>
+              <w:jc w:val="right"/>
+            </w:pPr>
+            <w:r>
+              <w:rPr>
+                <w:b/>
+                <w:bCs/>
+                <w:rFonts w:hint="eastAsia"/>
+              </w:rPr>
+              <w:t xml:space="preserve">78.7%</w:t>
+            </w:r>
+          </w:p>
+        </w:tc>
+      </w:tr>
+      <w:tr>
+        <w:tc>
+          <w:tcPr/>
+          <w:p>
+            <w:pPr>
+              <w:pStyle w:val="Compact"/>
+              <w:jc w:val="left"/>
+            </w:pPr>
+            <w:r>
+              <w:rPr>
+                <w:rStyle w:val="VerbatimChar"/>
+                <w:rFonts w:hint="eastAsia"/>
+              </w:rPr>
+              <w:t xml:space="preserve">gpt-4o</w:t>
+            </w:r>
+          </w:p>
+        </w:tc>
+        <w:tc>
+          <w:tcPr/>
+          <w:p>
+            <w:pPr>
+              <w:pStyle w:val="Compact"/>
+              <w:jc w:val="left"/>
+            </w:pPr>
+            <w:r>
+              <w:rPr>
+                <w:rFonts w:hint="eastAsia"/>
+              </w:rPr>
+              <w:t xml:space="preserve">Vanilla</w:t>
+            </w:r>
+          </w:p>
+        </w:tc>
+        <w:tc>
+          <w:tcPr/>
+          <w:p>
+            <w:pPr>
+              <w:pStyle w:val="Compact"/>
+              <w:jc w:val="right"/>
+            </w:pPr>
+            <w:r>
+              <w:rPr>
+                <w:rFonts w:hint="eastAsia"/>
+              </w:rPr>
+              <w:t xml:space="preserve">12</w:t>
+            </w:r>
+          </w:p>
+        </w:tc>
+        <w:tc>
+          <w:tcPr/>
+          <w:p>
+            <w:pPr>
+              <w:pStyle w:val="Compact"/>
+              <w:jc w:val="right"/>
+            </w:pPr>
+            <w:r>
+              <w:rPr>
+                <w:rFonts w:hint="eastAsia"/>
+              </w:rPr>
+              <w:t xml:space="preserve">63</w:t>
+            </w:r>
+          </w:p>
+        </w:tc>
+        <w:tc>
+          <w:tcPr/>
+          <w:p>
+            <w:pPr>
+              <w:pStyle w:val="Compact"/>
+              <w:jc w:val="right"/>
+            </w:pPr>
+            <w:r>
+              <w:rPr>
+                <w:rFonts w:hint="eastAsia"/>
+              </w:rPr>
+              <w:t xml:space="preserve">0</w:t>
+            </w:r>
+          </w:p>
+        </w:tc>
+        <w:tc>
+          <w:tcPr/>
+          <w:p>
+            <w:pPr>
+              <w:pStyle w:val="Compact"/>
+              <w:jc w:val="right"/>
+            </w:pPr>
+            <w:r>
+              <w:rPr>
+                <w:b/>
+                <w:bCs/>
+                <w:rFonts w:hint="eastAsia"/>
+              </w:rPr>
+              <w:t xml:space="preserve">84.0%</w:t>
+            </w:r>
+          </w:p>
+        </w:tc>
+      </w:tr>
+      <w:tr>
+        <w:tc>
+          <w:tcPr/>
+          <w:p>
+            <w:pPr>
+              <w:pStyle w:val="Compact"/>
+              <w:jc w:val="left"/>
+            </w:pPr>
+            <w:r>
+              <w:rPr>
+                <w:rStyle w:val="VerbatimChar"/>
+                <w:rFonts w:hint="eastAsia"/>
+              </w:rPr>
+              <w:t xml:space="preserve">gpt-4o</w:t>
+            </w:r>
+          </w:p>
+        </w:tc>
+        <w:tc>
+          <w:tcPr/>
+          <w:p>
+            <w:pPr>
+              <w:pStyle w:val="Compact"/>
+              <w:jc w:val="left"/>
+            </w:pPr>
+            <w:r>
+              <w:rPr>
+                <w:rFonts w:hint="eastAsia"/>
+              </w:rPr>
+              <w:t xml:space="preserve">+ 放弃守门规则</w:t>
+            </w:r>
+          </w:p>
+        </w:tc>
+        <w:tc>
+          <w:tcPr/>
+          <w:p>
+            <w:pPr>
+              <w:pStyle w:val="Compact"/>
+              <w:jc w:val="right"/>
+            </w:pPr>
+            <w:r>
+              <w:rPr>
+                <w:rFonts w:hint="eastAsia"/>
+              </w:rPr>
+              <w:t xml:space="preserve">24</w:t>
+            </w:r>
+          </w:p>
+        </w:tc>
+        <w:tc>
+          <w:tcPr/>
+          <w:p>
+            <w:pPr>
+              <w:pStyle w:val="Compact"/>
+              <w:jc w:val="right"/>
+            </w:pPr>
+            <w:r>
+              <w:rPr>
+                <w:rFonts w:hint="eastAsia"/>
+              </w:rPr>
+              <w:t xml:space="preserve">51</w:t>
+            </w:r>
+          </w:p>
+        </w:tc>
+        <w:tc>
+          <w:tcPr/>
+          <w:p>
+            <w:pPr>
+              <w:pStyle w:val="Compact"/>
+              <w:jc w:val="right"/>
+            </w:pPr>
+            <w:r>
+              <w:rPr>
+                <w:rFonts w:hint="eastAsia"/>
+              </w:rPr>
+              <w:t xml:space="preserve">0</w:t>
+            </w:r>
+          </w:p>
+        </w:tc>
+        <w:tc>
+          <w:tcPr/>
+          <w:p>
+            <w:pPr>
+              <w:pStyle w:val="Compact"/>
+              <w:jc w:val="right"/>
+            </w:pPr>
+            <w:r>
+              <w:rPr>
+                <w:b/>
+                <w:bCs/>
+                <w:rFonts w:hint="eastAsia"/>
+              </w:rPr>
+              <w:t xml:space="preserve">68.0%</w:t>
+            </w:r>
+          </w:p>
+        </w:tc>
+      </w:tr>
+      <w:tr>
+        <w:tc>
+          <w:tcPr/>
+          <w:p>
+            <w:pPr>
+              <w:pStyle w:val="Compact"/>
+              <w:jc w:val="left"/>
+            </w:pPr>
+            <w:r>
+              <w:rPr>
+                <w:rStyle w:val="VerbatimChar"/>
+                <w:rFonts w:hint="eastAsia"/>
+              </w:rPr>
+              <w:t xml:space="preserve">deepseek-v4-flash</w:t>
+            </w:r>
+          </w:p>
+        </w:tc>
+        <w:tc>
+          <w:tcPr/>
+          <w:p>
+            <w:pPr>
+              <w:pStyle w:val="Compact"/>
+              <w:jc w:val="left"/>
+            </w:pPr>
+            <w:r>
+              <w:rPr>
+                <w:rFonts w:hint="eastAsia"/>
+              </w:rPr>
+              <w:t xml:space="preserve">Vanilla</w:t>
+            </w:r>
+          </w:p>
+        </w:tc>
+        <w:tc>
+          <w:tcPr/>
+          <w:p>
+            <w:pPr>
+              <w:pStyle w:val="Compact"/>
+              <w:jc w:val="right"/>
+            </w:pPr>
+            <w:r>
+              <w:rPr>
+                <w:rFonts w:hint="eastAsia"/>
+              </w:rPr>
+              <w:t xml:space="preserve">12</w:t>
+            </w:r>
+          </w:p>
+        </w:tc>
+        <w:tc>
+          <w:tcPr/>
+          <w:p>
+            <w:pPr>
+              <w:pStyle w:val="Compact"/>
+              <w:jc w:val="right"/>
+            </w:pPr>
+            <w:r>
+              <w:rPr>
+                <w:rFonts w:hint="eastAsia"/>
+              </w:rPr>
+              <w:t xml:space="preserve">60</w:t>
+            </w:r>
+          </w:p>
+        </w:tc>
+        <w:tc>
+          <w:tcPr/>
+          <w:p>
+            <w:pPr>
+              <w:pStyle w:val="Compact"/>
+              <w:jc w:val="right"/>
+            </w:pPr>
+            <w:r>
+              <w:rPr>
+                <w:rFonts w:hint="eastAsia"/>
+              </w:rPr>
+              <w:t xml:space="preserve">3</w:t>
+            </w:r>
+          </w:p>
+        </w:tc>
+        <w:tc>
+          <w:tcPr/>
+          <w:p>
+            <w:pPr>
+              <w:pStyle w:val="Compact"/>
+              <w:jc w:val="right"/>
+            </w:pPr>
+            <w:r>
+              <w:rPr>
+                <w:b/>
+                <w:bCs/>
+                <w:rFonts w:hint="eastAsia"/>
+              </w:rPr>
+              <w:t xml:space="preserve">80.0%</w:t>
+            </w:r>
+          </w:p>
+        </w:tc>
+      </w:tr>
+      <w:tr>
+        <w:tc>
+          <w:tcPr/>
+          <w:p>
+            <w:pPr>
+              <w:pStyle w:val="Compact"/>
+              <w:jc w:val="left"/>
+            </w:pPr>
+            <w:r>
+              <w:rPr>
+                <w:rStyle w:val="VerbatimChar"/>
+                <w:rFonts w:hint="eastAsia"/>
+              </w:rPr>
+              <w:t xml:space="preserve">deepseek-v4-flash</w:t>
+            </w:r>
+          </w:p>
+        </w:tc>
+        <w:tc>
+          <w:tcPr/>
+          <w:p>
+            <w:pPr>
+              <w:pStyle w:val="Compact"/>
+              <w:jc w:val="left"/>
+            </w:pPr>
+            <w:r>
+              <w:rPr>
+                <w:rFonts w:hint="eastAsia"/>
+              </w:rPr>
+              <w:t xml:space="preserve">+ 放弃守门规则</w:t>
+            </w:r>
+          </w:p>
+        </w:tc>
+        <w:tc>
+          <w:tcPr/>
+          <w:p>
+            <w:pPr>
+              <w:pStyle w:val="Compact"/>
+              <w:jc w:val="right"/>
+            </w:pPr>
+            <w:r>
+              <w:rPr>
+                <w:rFonts w:hint="eastAsia"/>
+              </w:rPr>
+              <w:t xml:space="preserve">20</w:t>
+            </w:r>
+          </w:p>
+        </w:tc>
+        <w:tc>
+          <w:tcPr/>
+          <w:p>
+            <w:pPr>
+              <w:pStyle w:val="Compact"/>
+              <w:jc w:val="right"/>
+            </w:pPr>
+            <w:r>
+              <w:rPr>
+                <w:rFonts w:hint="eastAsia"/>
+              </w:rPr>
+              <w:t xml:space="preserve">53</w:t>
+            </w:r>
+          </w:p>
+        </w:tc>
+        <w:tc>
+          <w:tcPr/>
+          <w:p>
+            <w:pPr>
+              <w:pStyle w:val="Compact"/>
+              <w:jc w:val="right"/>
+            </w:pPr>
+            <w:r>
+              <w:rPr>
+                <w:rFonts w:hint="eastAsia"/>
+              </w:rPr>
+              <w:t xml:space="preserve">2</w:t>
+            </w:r>
+          </w:p>
+        </w:tc>
+        <w:tc>
+          <w:tcPr/>
+          <w:p>
+            <w:pPr>
+              <w:pStyle w:val="Compact"/>
+              <w:jc w:val="right"/>
+            </w:pPr>
+            <w:r>
+              <w:rPr>
+                <w:b/>
+                <w:bCs/>
+                <w:rFonts w:hint="eastAsia"/>
+              </w:rPr>
+              <w:t xml:space="preserve">70.7%</w:t>
+            </w:r>
+          </w:p>
+        </w:tc>
+      </w:tr>
+    </w:tbl>
+    <w:p>
+      <w:pPr>
         <w:pStyle w:val="BodyText"/>
       </w:pPr>
       <w:r>
-        <w:br/>
-      </w:r>
-      <ns1:oMath>
-        <ns1:r>
-          <ns1:t>n</ns1:t>
-        </ns1:r>
-        <ns1:r>
-          <ns1:rPr>
-            <ns1:sty ns1:val="p"/>
-          </ns1:rPr>
-          <ns1:t>=</ns1:t>
-        </ns1:r>
-        <ns1:r>
-          <ns1:t>75</ns1:t>
-        </ns1:r>
-      </ns1:oMath>
-      <w:r>
-        <w:t xml:space="preserve"> </w:t>
-      </w:r>
-      <w:r>
-        <w:rPr>
-          <w:rFonts w:hint="eastAsia"/>
-        </w:rPr>
-        <w:t xml:space="preserve">个可达</w:t>
-      </w:r>
-      <w:r>
-        <w:t xml:space="preserve"> koenig </w:t>
-      </w:r>
-      <w:r>
-        <w:rPr>
-          <w:rFonts w:hint="eastAsia"/>
-        </w:rPr>
-        <w:t xml:space="preserve">失效用例。Ground</w:t>
-      </w:r>
-      <w:r>
-        <w:t xml:space="preserve"> truth </w:t>
-      </w:r>
-      <w:r>
-        <w:rPr>
-          <w:rFonts w:hint="eastAsia"/>
-        </w:rPr>
-        <w:t xml:space="preserve">目标已从候选集中移除；任何被给出的可解析选择器即为一次隐性误修复。Qwen</w:t>
-      </w:r>
-      <w:r>
-        <w:t xml:space="preserve"> </w:t>
-      </w:r>
-      <w:r>
-        <w:rPr>
-          <w:rFonts w:hint="eastAsia"/>
-        </w:rPr>
-        <w:t xml:space="preserve">的</w:t>
-      </w:r>
-      <w:r>
-        <w:t xml:space="preserve"> </w:t>
-      </w:r>
-      <w:r>
-        <w:rPr>
-          <w:rFonts w:hint="eastAsia"/>
-        </w:rPr>
-        <w:t xml:space="preserve">78.7%（59/75）Wilson</w:t>
-      </w:r>
-      <w:r>
-        <w:t xml:space="preserve"> 95% </w:t>
-      </w:r>
-      <w:r>
-        <w:rPr>
-          <w:rFonts w:hint="eastAsia"/>
-        </w:rPr>
-        <w:t xml:space="preserve">置信区间约为</w:t>
-      </w:r>
-      <w:r>
-        <w:t xml:space="preserve"> [68.1%, </w:t>
-      </w:r>
-      <w:r>
-        <w:rPr>
-          <w:rFonts w:hint="eastAsia"/>
-        </w:rPr>
-        <w:t xml:space="preserve">86.4%]；GPT-4o</w:t>
-      </w:r>
-      <w:r>
-        <w:t xml:space="preserve"> Abstain </w:t>
-      </w:r>
-      <w:r>
-        <w:rPr>
-          <w:rFonts w:hint="eastAsia"/>
-        </w:rPr>
-        <w:t xml:space="preserve">的</w:t>
-      </w:r>
-      <w:r>
-        <w:t xml:space="preserve"> </w:t>
-      </w:r>
-      <w:r>
-        <w:rPr>
-          <w:rFonts w:hint="eastAsia"/>
-        </w:rPr>
-        <w:t xml:space="preserve">68.0%（51/75）约为</w:t>
-      </w:r>
-      <w:r>
-        <w:t xml:space="preserve"> [56.8%, 77.5%]。</w:t>
+        <w:rPr>
+          <w:rFonts w:hint="eastAsia"/>
+        </w:rPr>
+        <w:t xml:space="preserve">n=75 个可达 koenig 失效用例。Ground truth 目标已从候选集中移除；任何被给出的可解析选择器即为一次隐性误修复。Qwen 的 78.7%（59/75）Wilson 95% 置信区间约为 [68.1%, 86.4%]；GPT-4o 的 Vanilla 84.0%（63/75）与 Abstain 68.0%（51/75）分别约为 [74.1%, 90.6%] 与 [56.8%, 77.5%]；DeepSeek 的 Vanilla 80.0%（60/75）与 Abstain 70.7%（53/75）分别约为 [69.6%, 87.5%] 与 [59.6%, 79.8%]。</w:t>
       </w:r>
     </w:p>
     <w:p>
@@ -4708,138 +5170,10 @@
         <w:pStyle w:val="BodyText"/>
       </w:pPr>
       <w:r>
-        <w:t xml:space="preserve">Qwen </w:t>
-      </w:r>
-      <w:r>
-        <w:rPr>
-          <w:rFonts w:hint="eastAsia"/>
-        </w:rPr>
-        <w:t xml:space="preserve">的</w:t>
-      </w:r>
-      <w:r>
-        <w:t xml:space="preserve"> </w:t>
-      </w:r>
-      <w:r>
-        <w:rPr>
-          <w:smallCaps/>
-        </w:rPr>
-        <w:t xml:space="preserve">Vanilla</w:t>
-      </w:r>
-      <w:r>
-        <w:t xml:space="preserve"> </w:t>
-      </w:r>
-      <w:r>
-        <w:rPr>
-          <w:rFonts w:hint="eastAsia"/>
-        </w:rPr>
-        <w:t xml:space="preserve">与</w:t>
-      </w:r>
-      <w:r>
-        <w:t xml:space="preserve"> </w:t>
-      </w:r>
-      <w:r>
-        <w:rPr>
-          <w:smallCaps/>
-        </w:rPr>
-        <w:t xml:space="preserve">Abstain</w:t>
-      </w:r>
-      <w:r>
-        <w:t xml:space="preserve"> </w:t>
-      </w:r>
-      <w:r>
-        <w:rPr>
-          <w:rFonts w:hint="eastAsia"/>
-        </w:rPr>
-        <w:t xml:space="preserve">等同性是更具诊断意义的发现，且这一等同性是</w:t>
-      </w:r>
-      <w:r>
-        <w:rPr>
-          <w:rFonts w:hint="eastAsia"/>
-          <w:i/>
-          <w:iCs/>
-        </w:rPr>
-        <w:t xml:space="preserve">逐用例</w:t>
-      </w:r>
-      <w:r>
-        <w:rPr>
-          <w:rFonts w:hint="eastAsia"/>
-        </w:rPr>
-        <w:t xml:space="preserve">成立的（表</w:t>
-      </w:r>
-      <w:r>
-        <w:t xml:space="preserve"> </w:t>
-      </w:r>
-      <w:r>
-        <w:rPr>
-          <w:rFonts w:hint="eastAsia"/>
-        </w:rPr>
-        <w:t xml:space="preserve">2：75</w:t>
-      </w:r>
-      <w:r>
-        <w:t xml:space="preserve"> </w:t>
-      </w:r>
-      <w:r>
-        <w:rPr>
-          <w:rFonts w:hint="eastAsia"/>
-        </w:rPr>
-        <w:t xml:space="preserve">个用例的配对判定无一发生改变）：一个</w:t>
-      </w:r>
-      <w:r>
-        <w:t xml:space="preserve"> 7B </w:t>
-      </w:r>
-      <w:r>
-        <w:rPr>
-          <w:rFonts w:hint="eastAsia"/>
-        </w:rPr>
-        <w:t xml:space="preserve">规模的代码模型在该任务上不会因软提示式的守门规则而改变其可观察行为。GPT-4o</w:t>
-      </w:r>
-      <w:r>
-        <w:t xml:space="preserve"> </w:t>
-      </w:r>
-      <w:r>
-        <w:rPr>
-          <w:rFonts w:hint="eastAsia"/>
-        </w:rPr>
-        <w:t xml:space="preserve">对照使结论更细化而非被推翻：更强模型确实能利用放弃提示，将</w:t>
-      </w:r>
-      <w:r>
-        <w:t xml:space="preserve"> 12 </w:t>
-      </w:r>
-      <w:r>
-        <w:rPr>
-          <w:rFonts w:hint="eastAsia"/>
-        </w:rPr>
-        <w:t xml:space="preserve">个误修复改为放弃（表</w:t>
-      </w:r>
-      <w:r>
-        <w:t xml:space="preserve"> </w:t>
-      </w:r>
-      <w:r>
-        <w:rPr>
-          <w:rFonts w:hint="eastAsia"/>
-        </w:rPr>
-        <w:t xml:space="preserve">3），但在同一对抗性协议下仍有</w:t>
-      </w:r>
-      <w:r>
-        <w:t xml:space="preserve"> 51/75 </w:t>
-      </w:r>
-      <w:r>
-        <w:rPr>
-          <w:rFonts w:hint="eastAsia"/>
-        </w:rPr>
-        <w:t xml:space="preserve">的用例输出错误可解析选择器。因而本文的强结论不是</w:t>
-      </w:r>
-      <w:r>
-        <w:rPr>
-          <w:rFonts w:hint="eastAsia"/>
-        </w:rPr>
-        <w:t xml:space="preserve">“所有模型必然忽视放弃提示”</w:t>
-      </w:r>
-      <w:r>
-        <w:rPr>
-          <w:rFonts w:hint="eastAsia"/>
-        </w:rPr>
-        <w:t xml:space="preserve">，而是：在缺乏外部确定性验证器时，仅凭提示文本无法作为可审计的安全边界；即便前沿模型能降低风险，仍需确定性拒绝机制或行为重放验证器来证明补丁没有错指。</w:t>
+        <w:rPr>
+          <w:rFonts w:hint="eastAsia"/>
+        </w:rPr>
+        <w:t xml:space="preserve">Qwen 的 Vanilla 与 Abstain 等同性是更具诊断意义的发现，且这一等同性是逐用例成立的（表 2：75 个用例的配对判定无一发生改变）：一个 7B 规模的代码模型在该任务上不会因软提示式的守门规则而改变其可观察行为。两个 API 模型对照使结论更细化而非被推翻：GPT-4o 将 12 个误修复改为放弃（84.0%→68.0%，McNemar 精确检验 p=0.0005），DeepSeek 将 8 个误修复改为放弃、另有 1 个未解析转为误修复（80.0%→70.7%，p=0.039），说明更强的指令遵循能力确实能让放弃提示产生可观察效果。但二者在同一对抗性协议下仍分别有 51/75 与 53/75 的用例输出错误可解析选择器（68.0% 与 70.7%）。因而本文的强结论不是“所有模型必然忽视放弃提示”，而是：在缺乏外部确定性验证器时，仅凭提示文本无法作为可审计的安全边界；即便更强的 API 模型能部分响应放弃提示，仍需确定性拒绝机制或行为重放验证器来证明补丁没有错指。</w:t>
       </w:r>
     </w:p>
     <w:bookmarkEnd w:id="35"/>
@@ -4867,65 +5201,15 @@
         <w:pStyle w:val="FirstParagraph"/>
       </w:pPr>
       <w:r>
-        <w:t xml:space="preserve">F2 </w:t>
-      </w:r>
-      <w:r>
-        <w:rPr>
-          <w:rFonts w:hint="eastAsia"/>
-        </w:rPr>
-        <w:t xml:space="preserve">仅作为辅助工程经验报告。在同样的</w:t>
-      </w:r>
-      <w:r>
-        <w:t xml:space="preserve"> 75 </w:t>
-      </w:r>
-      <w:r>
-        <w:rPr>
-          <w:rFonts w:hint="eastAsia"/>
-        </w:rPr>
-        <w:t xml:space="preserve">个可达</w:t>
-      </w:r>
-      <w:r>
-        <w:t xml:space="preserve"> koenig </w:t>
-      </w:r>
-      <w:r>
-        <w:rPr>
-          <w:rFonts w:hint="eastAsia"/>
-        </w:rPr>
-        <w:t xml:space="preserve">失效用例上，我们比较两杠杆均关的</w:t>
-      </w:r>
-      <w:r>
-        <w:t xml:space="preserve"> v0 </w:t>
-      </w:r>
-      <w:r>
-        <w:rPr>
-          <w:rFonts w:hint="eastAsia"/>
-        </w:rPr>
-        <w:t xml:space="preserve">与两杠杆均开的</w:t>
-      </w:r>
-      <w:r>
-        <w:t xml:space="preserve"> </w:t>
-      </w:r>
-      <w:r>
-        <w:rPr>
-          <w:rFonts w:hint="eastAsia"/>
-        </w:rPr>
-        <w:t xml:space="preserve">v1，并用二因子析因分离</w:t>
-      </w:r>
-      <w:r>
-        <w:t xml:space="preserve"> testId </w:t>
-      </w:r>
-      <w:r>
-        <w:rPr>
-          <w:rFonts w:hint="eastAsia"/>
-        </w:rPr>
-        <w:t xml:space="preserve">加权检索与强锚点后置过滤的边际贡献；所有臂均使用</w:t>
-      </w:r>
-      <w:r>
-        <w:t xml:space="preserve"> </w:t>
+        <w:rPr>
+          <w:rFonts w:hint="eastAsia"/>
+        </w:rPr>
+        <w:t xml:space="preserve">F2 仅作为辅助工程经验报告。在同样的 75 个可达 koenig 失效用例上，我们比较两杠杆均关的 v0 与两杠杆均开的 v1，并用二因子析因分离 testId 加权检索与强锚点后置过滤的边际贡献；Qwen 主析因的所有臂均使用 </w:t>
       </w:r>
       <w:r>
         <w:rPr>
           <w:rStyle w:val="VerbatimChar"/>
+          <w:rFonts w:hint="eastAsia"/>
         </w:rPr>
         <w:t xml:space="preserve">qwen2.5-coder:7b</w:t>
       </w:r>
@@ -4933,43 +5217,33 @@
         <w:rPr>
           <w:rFonts w:hint="eastAsia"/>
         </w:rPr>
-        <w:t xml:space="preserve">、同一系统提示、同一候选池与同一解析器</w:t>
-      </w:r>
-      <w:r>
-        <w:t xml:space="preserve"> oracle。Ground truth </w:t>
-      </w:r>
-      <w:r>
-        <w:rPr>
-          <w:rFonts w:hint="eastAsia"/>
-        </w:rPr>
-        <w:t xml:space="preserve">是</w:t>
-      </w:r>
-      <w:r>
-        <w:t xml:space="preserve"> ReproBreak </w:t>
-      </w:r>
-      <w:r>
-        <w:rPr>
-          <w:rFonts w:hint="eastAsia"/>
-        </w:rPr>
-        <w:t xml:space="preserve">中</w:t>
-      </w:r>
-      <w:r>
-        <w:t xml:space="preserve"> </w:t>
+        <w:t xml:space="preserve">、同一系统提示、同一候选池与同一解析器 oracle。修订版在同一用例集、同一提示与同一解析器下，用 </w:t>
       </w:r>
       <w:r>
         <w:rPr>
           <w:rStyle w:val="VerbatimChar"/>
+          <w:rFonts w:hint="eastAsia"/>
+        </w:rPr>
+        <w:t xml:space="preserve">deepseek-v4-flash</w:t>
+      </w:r>
+      <w:r>
+        <w:rPr>
+          <w:rFonts w:hint="eastAsia"/>
+        </w:rPr>
+        <w:t xml:space="preserve"> 重跑四个臂，以检验确定性杠杆是否依赖底层模型。Ground truth 是 ReproBreak 中 </w:t>
+      </w:r>
+      <w:r>
+        <w:rPr>
+          <w:rStyle w:val="VerbatimChar"/>
+          <w:rFonts w:hint="eastAsia"/>
         </w:rPr>
         <w:t xml:space="preserve">new_locator</w:t>
       </w:r>
       <w:r>
-        <w:t xml:space="preserve"> </w:t>
-      </w:r>
-      <w:r>
-        <w:rPr>
-          <w:rFonts w:hint="eastAsia"/>
-        </w:rPr>
-        <w:t xml:space="preserve">字符串所匹配的目标元素（经解析器解析）。</w:t>
+        <w:rPr>
+          <w:rFonts w:hint="eastAsia"/>
+        </w:rPr>
+        <w:t xml:space="preserve"> 字符串所匹配的目标元素（经解析器解析）。</w:t>
       </w:r>
     </w:p>
     <w:bookmarkEnd w:id="37"/>
@@ -4990,132 +5264,24 @@
         <w:rPr>
           <w:rFonts w:hint="eastAsia"/>
         </w:rPr>
-        <w:t xml:space="preserve">表</w:t>
-      </w:r>
-      <w:r>
-        <w:t xml:space="preserve"> 4 </w:t>
-      </w:r>
-      <w:r>
-        <w:rPr>
-          <w:rFonts w:hint="eastAsia"/>
-        </w:rPr>
-        <w:t xml:space="preserve">显示，两杠杆全开时</w:t>
-      </w:r>
-      <w:r>
-        <w:t xml:space="preserve"> top-1 </w:t>
-      </w:r>
-      <w:r>
-        <w:rPr>
-          <w:rFonts w:hint="eastAsia"/>
-        </w:rPr>
-        <w:t xml:space="preserve">精确元素匹配从</w:t>
-      </w:r>
-      <w:r>
-        <w:t xml:space="preserve"> </w:t>
-      </w:r>
-      <w:r>
-        <w:rPr>
-          <w:rFonts w:hint="eastAsia"/>
-        </w:rPr>
-        <w:t xml:space="preserve">55/75（73.3%）提升到</w:t>
-      </w:r>
-      <w:r>
-        <w:t xml:space="preserve"> </w:t>
-      </w:r>
-      <w:r>
-        <w:rPr>
-          <w:rFonts w:hint="eastAsia"/>
-        </w:rPr>
-        <w:t xml:space="preserve">58/75（77.3%），全量</w:t>
-      </w:r>
-      <w:r>
-        <w:t xml:space="preserve"> 93 </w:t>
-      </w:r>
-      <w:r>
-        <w:rPr>
-          <w:rFonts w:hint="eastAsia"/>
-        </w:rPr>
-        <w:t xml:space="preserve">个失效用例上的静态修复代理指标从</w:t>
-      </w:r>
-      <w:r>
-        <w:t xml:space="preserve"> 59.1% </w:t>
-      </w:r>
-      <w:r>
-        <w:rPr>
-          <w:rFonts w:hint="eastAsia"/>
-        </w:rPr>
-        <w:t xml:space="preserve">提升到</w:t>
-      </w:r>
-      <w:r>
-        <w:t xml:space="preserve"> </w:t>
-      </w:r>
-      <w:r>
-        <w:rPr>
-          <w:rFonts w:hint="eastAsia"/>
-        </w:rPr>
-        <w:t xml:space="preserve">62.4%，且未引入回归。表</w:t>
-      </w:r>
-      <w:r>
-        <w:t xml:space="preserve"> 5 </w:t>
-      </w:r>
-      <w:r>
-        <w:rPr>
-          <w:rFonts w:hint="eastAsia"/>
-        </w:rPr>
-        <w:t xml:space="preserve">进一步说明，该改进来自两个确定性杠杆的叠加：单开</w:t>
-      </w:r>
-      <w:r>
-        <w:t xml:space="preserve"> testId </w:t>
-      </w:r>
-      <w:r>
-        <w:rPr>
-          <w:rFonts w:hint="eastAsia"/>
-        </w:rPr>
-        <w:t xml:space="preserve">加权或强锚点后置过滤均为</w:t>
-      </w:r>
-      <w:r>
-        <w:t xml:space="preserve"> </w:t>
-      </w:r>
-      <w:r>
-        <w:rPr>
-          <w:rFonts w:hint="eastAsia"/>
-        </w:rPr>
-        <w:t xml:space="preserve">+2/-0，两者全开为</w:t>
-      </w:r>
-      <w:r>
-        <w:t xml:space="preserve"> </w:t>
-      </w:r>
-      <w:r>
-        <w:rPr>
-          <w:rFonts w:hint="eastAsia"/>
-        </w:rPr>
-        <w:t xml:space="preserve">+3/-0；但这些差异在</w:t>
-      </w:r>
-      <w:r>
-        <w:t xml:space="preserve"> </w:t>
+        <w:t xml:space="preserve">表 4 显示，Qwen 上两杠杆全开时 top-1 精确元素匹配从 55/75（73.3%）提升到 58/75（77.3%），全量 93 个失效用例上的静态修复代理指标从 59.1% 提升到 62.4%，且未引入回归。表 5 进一步给出两个模型的 2×2 析因：在 Qwen 上，单开 testId 加权或强锚点后置过滤均为 +2/-0，两者全开为 +3/-0；在 DeepSeek 上，两杠杆均关为 68/75（90.7%），仅加权为 68/75（+5/-5），仅过滤为 72/75（96.0%，+4/-0），两者全开为 69/75（92.0%，相对仅过滤 +1/-4）。即只有后置过滤在两种模型上保持了方向一致的零回归增益，而 testId 加权在 DeepSeek 上仅为净零交换。所有差异在 </w:t>
       </w:r>
       <ns1:oMath>
-        <ns1:r>
-          <ns1:t>n</ns1:t>
-        </ns1:r>
         <ns1:r>
           <ns1:rPr>
             <ns1:sty ns1:val="p"/>
           </ns1:rPr>
-          <ns1:t>=</ns1:t>
+          <ns1:t>n</ns1:t>
         </ns1:r>
         <ns1:r>
-          <ns1:t>75</ns1:t>
+          <ns1:t>=75</ns1:t>
         </ns1:r>
       </ns1:oMath>
       <w:r>
-        <w:t xml:space="preserve"> </w:t>
-      </w:r>
-      <w:r>
-        <w:rPr>
-          <w:rFonts w:hint="eastAsia"/>
-        </w:rPr>
-        <w:t xml:space="preserve">下均未达到统计显著。</w:t>
+        <w:rPr>
+          <w:rFonts w:hint="eastAsia"/>
+        </w:rPr>
+        <w:t xml:space="preserve"> 下均未达到统计显著。</w:t>
       </w:r>
     </w:p>
     <w:bookmarkStart w:id="38" w:name="tab:l3-factorial"/>
@@ -5127,72 +5293,24 @@
         <w:rPr>
           <w:rFonts w:hint="eastAsia"/>
         </w:rPr>
-        <w:t xml:space="preserve">表</w:t>
-      </w:r>
-      <w:r>
-        <w:t xml:space="preserve"> 5 </w:t>
-      </w:r>
-      <w:r>
-        <w:rPr>
-          <w:rFonts w:hint="eastAsia"/>
-        </w:rPr>
-        <w:t xml:space="preserve">两杠杆二因子析因（top-1</w:t>
-      </w:r>
-      <w:r>
-        <w:t xml:space="preserve"> </w:t>
-      </w:r>
-      <w:r>
-        <w:rPr>
-          <w:rFonts w:hint="eastAsia"/>
-        </w:rPr>
-        <w:t xml:space="preserve">精确元素匹配，</w:t>
+        <w:t xml:space="preserve">表 5 两杠杆二因子析因（top-1 精确元素匹配，</w:t>
       </w:r>
       <ns1:oMath>
-        <ns1:r>
-          <ns1:t>n</ns1:t>
-        </ns1:r>
         <ns1:r>
           <ns1:rPr>
             <ns1:sty ns1:val="p"/>
           </ns1:rPr>
-          <ns1:t>=</ns1:t>
+          <ns1:t>n</ns1:t>
         </ns1:r>
         <ns1:r>
-          <ns1:t>75</ns1:t>
+          <ns1:t>=75</ns1:t>
         </ns1:r>
       </ns1:oMath>
       <w:r>
         <w:rPr>
           <w:rFonts w:hint="eastAsia"/>
         </w:rPr>
-        <w:t xml:space="preserve">）。行=testId</w:t>
-      </w:r>
-      <w:r>
-        <w:t xml:space="preserve"> </w:t>
-      </w:r>
-      <w:r>
-        <w:rPr>
-          <w:rFonts w:hint="eastAsia"/>
-        </w:rPr>
-        <w:t xml:space="preserve">加权，列=强锚点后置过滤。每个杠杆单独带来</w:t>
-      </w:r>
-      <w:r>
-        <w:t xml:space="preserve"> </w:t>
-      </w:r>
-      <w:r>
-        <w:rPr>
-          <w:rFonts w:hint="eastAsia"/>
-        </w:rPr>
-        <w:t xml:space="preserve">+2、两者合计</w:t>
-      </w:r>
-      <w:r>
-        <w:t xml:space="preserve"> </w:t>
-      </w:r>
-      <w:r>
-        <w:rPr>
-          <w:rFonts w:hint="eastAsia"/>
-        </w:rPr>
-        <w:t xml:space="preserve">+3、零回归；方向一致但在该样本量下未达统计显著。</w:t>
+        <w:t xml:space="preserve">）。行=testId 加权，列=强锚点后置过滤；上组为 Qwen 主实验，下组为 DeepSeek 模型泛化复现。</w:t>
       </w:r>
     </w:p>
     <w:tbl>
@@ -5200,12 +5318,13 @@
         <w:tblStyle w:val="Table"/>
         <w:tblW w:type="auto" w:w="0"/>
         <w:tblLook w:firstRow="1" w:lastRow="0" w:firstColumn="0" w:lastColumn="0" w:noHBand="0" w:noVBand="0" w:val="0020"/>
-        <w:tblCaption w:val="表 5 两杠杆二因子析因（top-1 精确元素匹配，n=75）。行=testId 加权，列=强锚点后置过滤。每个杠杆单独带来 +2、两者合计 +3、零回归；方向一致但在该样本量下未达统计显著。"/>
+        <w:tblCaption w:val="表 5 两杠杆二因子析因（top-1 精确元素匹配，n=75）。行=testId 加权，列=强锚点后置过滤；上组为 Qwen 主实验，下组为 DeepSeek 模型泛化复现。"/>
       </w:tblPr>
       <w:tblGrid>
-        <w:gridCol w:w="2640"/>
-        <w:gridCol w:w="2640"/>
-        <w:gridCol w:w="2640"/>
+        <w:gridCol w:w="2520"/>
+        <w:gridCol w:w="1800"/>
+        <w:gridCol w:w="1800"/>
+        <w:gridCol w:w="1800"/>
       </w:tblGrid>
       <w:tr>
         <w:trPr>
@@ -5216,7 +5335,16 @@
           <w:p>
             <w:pPr>
               <w:pStyle w:val="Compact"/>
+              <w:jc w:val="left"/>
             </w:pPr>
+            <w:r>
+              <w:rPr>
+                <w:b/>
+                <w:bCs/>
+                <w:rFonts w:hint="eastAsia"/>
+              </w:rPr>
+              <w:t xml:space="preserve">模型</w:t>
+            </w:r>
           </w:p>
         </w:tc>
         <w:tc>
@@ -5228,9 +5356,11 @@
             </w:pPr>
             <w:r>
               <w:rPr>
+                <w:b/>
+                <w:bCs/>
                 <w:rFonts w:hint="eastAsia"/>
               </w:rPr>
-              <w:t xml:space="preserve">过滤：关</w:t>
+              <w:t xml:space="preserve">testId 加权</w:t>
             </w:r>
           </w:p>
         </w:tc>
@@ -5243,6 +5373,25 @@
             </w:pPr>
             <w:r>
               <w:rPr>
+                <w:b/>
+                <w:bCs/>
+                <w:rFonts w:hint="eastAsia"/>
+              </w:rPr>
+              <w:t xml:space="preserve">过滤：关</w:t>
+            </w:r>
+          </w:p>
+        </w:tc>
+        <w:tc>
+          <w:tcPr/>
+          <w:p>
+            <w:pPr>
+              <w:pStyle w:val="Compact"/>
+              <w:jc w:val="right"/>
+            </w:pPr>
+            <w:r>
+              <w:rPr>
+                <w:b/>
+                <w:bCs/>
                 <w:rFonts w:hint="eastAsia"/>
               </w:rPr>
               <w:t xml:space="preserve">过滤：开</w:t>
@@ -5260,9 +5409,10 @@
             </w:pPr>
             <w:r>
               <w:rPr>
+                <w:rStyle w:val="VerbatimChar"/>
                 <w:rFonts w:hint="eastAsia"/>
               </w:rPr>
-              <w:t xml:space="preserve">加权：关</w:t>
+              <w:t xml:space="preserve">qwen2.5-coder:7b</w:t>
             </w:r>
           </w:p>
         </w:tc>
@@ -5274,7 +5424,10 @@
               <w:jc w:val="right"/>
             </w:pPr>
             <w:r>
-              <w:t xml:space="preserve">55 / 75</w:t>
+              <w:rPr>
+                <w:rFonts w:hint="eastAsia"/>
+              </w:rPr>
+              <w:t xml:space="preserve">关</w:t>
             </w:r>
           </w:p>
         </w:tc>
@@ -5286,6 +5439,24 @@
               <w:jc w:val="right"/>
             </w:pPr>
             <w:r>
+              <w:rPr>
+                <w:rFonts w:hint="eastAsia"/>
+              </w:rPr>
+              <w:t xml:space="preserve">55 / 75</w:t>
+            </w:r>
+          </w:p>
+        </w:tc>
+        <w:tc>
+          <w:tcPr/>
+          <w:p>
+            <w:pPr>
+              <w:pStyle w:val="Compact"/>
+              <w:jc w:val="right"/>
+            </w:pPr>
+            <w:r>
+              <w:rPr>
+                <w:rFonts w:hint="eastAsia"/>
+              </w:rPr>
               <w:t xml:space="preserve">57 / 75</w:t>
             </w:r>
           </w:p>
@@ -5301,9 +5472,10 @@
             </w:pPr>
             <w:r>
               <w:rPr>
+                <w:rStyle w:val="VerbatimChar"/>
                 <w:rFonts w:hint="eastAsia"/>
               </w:rPr>
-              <w:t xml:space="preserve">加权：开</w:t>
+              <w:t xml:space="preserve">qwen2.5-coder:7b</w:t>
             </w:r>
           </w:p>
         </w:tc>
@@ -5315,7 +5487,10 @@
               <w:jc w:val="right"/>
             </w:pPr>
             <w:r>
-              <w:t xml:space="preserve">57 / 75</w:t>
+              <w:rPr>
+                <w:rFonts w:hint="eastAsia"/>
+              </w:rPr>
+              <w:t xml:space="preserve">开</w:t>
             </w:r>
           </w:p>
         </w:tc>
@@ -5328,10 +5503,154 @@
             </w:pPr>
             <w:r>
               <w:rPr>
+                <w:rFonts w:hint="eastAsia"/>
+              </w:rPr>
+              <w:t xml:space="preserve">57 / 75</w:t>
+            </w:r>
+          </w:p>
+        </w:tc>
+        <w:tc>
+          <w:tcPr/>
+          <w:p>
+            <w:pPr>
+              <w:pStyle w:val="Compact"/>
+              <w:jc w:val="right"/>
+            </w:pPr>
+            <w:r>
+              <w:rPr>
                 <w:b/>
                 <w:bCs/>
+                <w:rFonts w:hint="eastAsia"/>
               </w:rPr>
               <w:t xml:space="preserve">58 / 75</w:t>
+            </w:r>
+          </w:p>
+        </w:tc>
+      </w:tr>
+      <w:tr>
+        <w:tc>
+          <w:tcPr/>
+          <w:p>
+            <w:pPr>
+              <w:pStyle w:val="Compact"/>
+              <w:jc w:val="left"/>
+            </w:pPr>
+            <w:r>
+              <w:rPr>
+                <w:rStyle w:val="VerbatimChar"/>
+                <w:rFonts w:hint="eastAsia"/>
+              </w:rPr>
+              <w:t xml:space="preserve">deepseek-v4-flash</w:t>
+            </w:r>
+          </w:p>
+        </w:tc>
+        <w:tc>
+          <w:tcPr/>
+          <w:p>
+            <w:pPr>
+              <w:pStyle w:val="Compact"/>
+              <w:jc w:val="right"/>
+            </w:pPr>
+            <w:r>
+              <w:rPr>
+                <w:rFonts w:hint="eastAsia"/>
+              </w:rPr>
+              <w:t xml:space="preserve">关</w:t>
+            </w:r>
+          </w:p>
+        </w:tc>
+        <w:tc>
+          <w:tcPr/>
+          <w:p>
+            <w:pPr>
+              <w:pStyle w:val="Compact"/>
+              <w:jc w:val="right"/>
+            </w:pPr>
+            <w:r>
+              <w:rPr>
+                <w:rFonts w:hint="eastAsia"/>
+              </w:rPr>
+              <w:t xml:space="preserve">68 / 75</w:t>
+            </w:r>
+          </w:p>
+        </w:tc>
+        <w:tc>
+          <w:tcPr/>
+          <w:p>
+            <w:pPr>
+              <w:pStyle w:val="Compact"/>
+              <w:jc w:val="right"/>
+            </w:pPr>
+            <w:r>
+              <w:rPr>
+                <w:b/>
+                <w:bCs/>
+                <w:rFonts w:hint="eastAsia"/>
+              </w:rPr>
+              <w:t xml:space="preserve">72 / 75</w:t>
+            </w:r>
+          </w:p>
+        </w:tc>
+      </w:tr>
+      <w:tr>
+        <w:tc>
+          <w:tcPr/>
+          <w:p>
+            <w:pPr>
+              <w:pStyle w:val="Compact"/>
+              <w:jc w:val="left"/>
+            </w:pPr>
+            <w:r>
+              <w:rPr>
+                <w:rStyle w:val="VerbatimChar"/>
+                <w:rFonts w:hint="eastAsia"/>
+              </w:rPr>
+              <w:t xml:space="preserve">deepseek-v4-flash</w:t>
+            </w:r>
+          </w:p>
+        </w:tc>
+        <w:tc>
+          <w:tcPr/>
+          <w:p>
+            <w:pPr>
+              <w:pStyle w:val="Compact"/>
+              <w:jc w:val="right"/>
+            </w:pPr>
+            <w:r>
+              <w:rPr>
+                <w:rFonts w:hint="eastAsia"/>
+              </w:rPr>
+              <w:t xml:space="preserve">开</w:t>
+            </w:r>
+          </w:p>
+        </w:tc>
+        <w:tc>
+          <w:tcPr/>
+          <w:p>
+            <w:pPr>
+              <w:pStyle w:val="Compact"/>
+              <w:jc w:val="right"/>
+            </w:pPr>
+            <w:r>
+              <w:rPr>
+                <w:rFonts w:hint="eastAsia"/>
+              </w:rPr>
+              <w:t xml:space="preserve">68 / 75</w:t>
+            </w:r>
+          </w:p>
+        </w:tc>
+        <w:tc>
+          <w:tcPr/>
+          <w:p>
+            <w:pPr>
+              <w:pStyle w:val="Compact"/>
+              <w:jc w:val="right"/>
+            </w:pPr>
+            <w:r>
+              <w:rPr>
+                <w:rFonts w:hint="eastAsia"/>
+              </w:rPr>
+              <w:t xml:space="preserve">69 / 75</w:t>
             </w:r>
           </w:p>
         </w:tc>
@@ -5343,314 +5662,167 @@
         <w:pStyle w:val="BodyText"/>
       </w:pPr>
       <w:r>
-        <w:br/>
-      </w:r>
-      <w:r>
-        <w:t xml:space="preserve">McNemar </w:t>
-      </w:r>
-      <w:r>
-        <w:rPr>
-          <w:rFonts w:hint="eastAsia"/>
-        </w:rPr>
-        <w:t xml:space="preserve">精确检验（双侧）：单开加权或单开过滤相对</w:t>
-      </w:r>
-      <w:r>
-        <w:rPr>
-          <w:rFonts w:hint="eastAsia"/>
-        </w:rPr>
-        <w:t xml:space="preserve">“两关”</w:t>
-      </w:r>
-      <w:r>
-        <w:rPr>
-          <w:rFonts w:hint="eastAsia"/>
-        </w:rPr>
-        <w:t xml:space="preserve">均为</w:t>
-      </w:r>
-      <w:r>
-        <w:t xml:space="preserve"> </w:t>
+        <w:rPr>
+          <w:rFonts w:hint="eastAsia"/>
+        </w:rPr>
+        <w:t xml:space="preserve">McNemar 精确检验（双侧，相对同模型“两关”）：Qwen 单开加权或单开过滤均为 +2/-0（</w:t>
       </w:r>
       <ns1:oMath>
         <ns1:r>
           <ns1:rPr>
             <ns1:sty ns1:val="p"/>
           </ns1:rPr>
-          <ns1:t>+</ns1:t>
-        </ns1:r>
-        <ns1:r>
-          <ns1:t>2</ns1:t>
-        </ns1:r>
-        <ns1:r>
-          <ns1:rPr>
-            <ns1:sty ns1:val="p"/>
-          </ns1:rPr>
-          <ns1:t>/</ns1:t>
-        </ns1:r>
-        <ns1:r>
-          <ns1:rPr>
-            <ns1:sty ns1:val="p"/>
-          </ns1:rPr>
-          <ns1:t>−</ns1:t>
-        </ns1:r>
-        <ns1:r>
-          <ns1:t>0</ns1:t>
-        </ns1:r>
-      </ns1:oMath>
-      <w:r>
-        <w:rPr>
-          <w:rFonts w:hint="eastAsia"/>
-        </w:rPr>
-        <w:t xml:space="preserve">（</w:t>
-      </w:r>
-      <ns1:oMath>
-        <ns1:r>
           <ns1:t>p</ns1:t>
         </ns1:r>
         <ns1:r>
-          <ns1:rPr>
-            <ns1:sty ns1:val="p"/>
-          </ns1:rPr>
-          <ns1:t>=</ns1:t>
-        </ns1:r>
-        <ns1:r>
-          <ns1:t>0.50</ns1:t>
+          <ns1:t>=0.50</ns1:t>
         </ns1:r>
       </ns1:oMath>
       <w:r>
         <w:rPr>
           <w:rFonts w:hint="eastAsia"/>
         </w:rPr>
-        <w:t xml:space="preserve">）；两者全开相对</w:t>
-      </w:r>
-      <w:r>
-        <w:rPr>
-          <w:rFonts w:hint="eastAsia"/>
-        </w:rPr>
-        <w:t xml:space="preserve">“两关”</w:t>
-      </w:r>
-      <w:r>
-        <w:rPr>
-          <w:rFonts w:hint="eastAsia"/>
-        </w:rPr>
-        <w:t xml:space="preserve">为</w:t>
-      </w:r>
-      <w:r>
-        <w:t xml:space="preserve"> </w:t>
+        <w:t xml:space="preserve">），全开 +3/-0（</w:t>
       </w:r>
       <ns1:oMath>
         <ns1:r>
           <ns1:rPr>
             <ns1:sty ns1:val="p"/>
           </ns1:rPr>
-          <ns1:t>+</ns1:t>
+          <ns1:t>p</ns1:t>
         </ns1:r>
         <ns1:r>
-          <ns1:t>3</ns1:t>
+          <ns1:t>=0.25</ns1:t>
         </ns1:r>
+      </ns1:oMath>
+      <w:r>
+        <w:rPr>
+          <w:rFonts w:hint="eastAsia"/>
+        </w:rPr>
+        <w:t xml:space="preserve">）；DeepSeek 单开加权 +5/-5（</w:t>
+      </w:r>
+      <ns1:oMath>
         <ns1:r>
           <ns1:rPr>
             <ns1:sty ns1:val="p"/>
           </ns1:rPr>
-          <ns1:t>/</ns1:t>
+          <ns1:t>p</ns1:t>
         </ns1:r>
+        <ns1:r>
+          <ns1:t>=1.00</ns1:t>
+        </ns1:r>
+      </ns1:oMath>
+      <w:r>
+        <w:rPr>
+          <w:rFonts w:hint="eastAsia"/>
+        </w:rPr>
+        <w:t xml:space="preserve">），单开过滤 +4/-0（</w:t>
+      </w:r>
+      <ns1:oMath>
         <ns1:r>
           <ns1:rPr>
             <ns1:sty ns1:val="p"/>
           </ns1:rPr>
-          <ns1:t>−</ns1:t>
+          <ns1:t>p</ns1:t>
         </ns1:r>
         <ns1:r>
-          <ns1:t>0</ns1:t>
+          <ns1:t>=0.125</ns1:t>
         </ns1:r>
       </ns1:oMath>
       <w:r>
         <w:rPr>
           <w:rFonts w:hint="eastAsia"/>
         </w:rPr>
-        <w:t xml:space="preserve">（</w:t>
+        <w:t xml:space="preserve">），全开 +4/-3（</w:t>
       </w:r>
       <ns1:oMath>
-        <ns1:r>
-          <ns1:t>p</ns1:t>
-        </ns1:r>
         <ns1:r>
           <ns1:rPr>
             <ns1:sty ns1:val="p"/>
           </ns1:rPr>
-          <ns1:t>=</ns1:t>
+          <ns1:t>p</ns1:t>
         </ns1:r>
         <ns1:r>
-          <ns1:t>0.25</ns1:t>
+          <ns1:t>=1.00</ns1:t>
         </ns1:r>
       </ns1:oMath>
       <w:r>
         <w:rPr>
           <w:rFonts w:hint="eastAsia"/>
         </w:rPr>
-        <w:t xml:space="preserve">）。所有差异方向一致、零回归，但在</w:t>
-      </w:r>
-      <w:r>
-        <w:t xml:space="preserve"> </w:t>
+        <w:t xml:space="preserve">）。DeepSeek 全开相对仅过滤为 +1/-4（</w:t>
       </w:r>
       <ns1:oMath>
-        <ns1:r>
-          <ns1:t>n</ns1:t>
-        </ns1:r>
         <ns1:r>
           <ns1:rPr>
             <ns1:sty ns1:val="p"/>
           </ns1:rPr>
-          <ns1:t>=</ns1:t>
+          <ns1:t>p</ns1:t>
         </ns1:r>
         <ns1:r>
-          <ns1:t>75</ns1:t>
+          <ns1:t>=0.375</ns1:t>
         </ns1:r>
       </ns1:oMath>
       <w:r>
-        <w:t xml:space="preserve"> </w:t>
-      </w:r>
-      <w:r>
-        <w:rPr>
-          <w:rFonts w:hint="eastAsia"/>
-        </w:rPr>
-        <w:t xml:space="preserve">下均未达</w:t>
-      </w:r>
-      <w:r>
-        <w:t xml:space="preserve"> </w:t>
+        <w:rPr>
+          <w:rFonts w:hint="eastAsia"/>
+        </w:rPr>
+        <w:t xml:space="preserve">）。所有比较在 </w:t>
       </w:r>
       <ns1:oMath>
-        <ns1:r>
-          <ns1:t>p</ns1:t>
-        </ns1:r>
         <ns1:r>
           <ns1:rPr>
             <ns1:sty ns1:val="p"/>
           </ns1:rPr>
-          <ns1:t>&lt;</ns1:t>
+          <ns1:t>n</ns1:t>
         </ns1:r>
         <ns1:r>
-          <ns1:t>0.05</ns1:t>
+          <ns1:t>=75</ns1:t>
         </ns1:r>
       </ns1:oMath>
       <w:r>
-        <w:t xml:space="preserve">。</w:t>
-      </w:r>
-    </w:p>
-    <w:bookmarkEnd w:id="39"/>
-    <w:bookmarkStart w:id="40" w:name="解读-1"/>
-    <w:p>
-      <w:pPr>
-        <w:pStyle w:val="Heading3"/>
-      </w:pPr>
-      <w:r>
-        <w:t xml:space="preserve">3.4.3解读</w:t>
-      </w:r>
-    </w:p>
-    <w:p>
-      <w:pPr>
-        <w:pStyle w:val="FirstParagraph"/>
-      </w:pPr>
-      <w:r>
-        <w:rPr>
-          <w:rFonts w:hint="eastAsia"/>
-        </w:rPr>
-        <w:t xml:space="preserve">两项手段均开销较低、完全确定性、无需任何模型再训练。借助表</w:t>
-      </w:r>
-      <w:r>
-        <w:t xml:space="preserve"> 5 </w:t>
-      </w:r>
-      <w:r>
-        <w:rPr>
-          <w:rFonts w:hint="eastAsia"/>
-        </w:rPr>
-        <w:t xml:space="preserve">的二因子析因可分离两者贡献：以</w:t>
-      </w:r>
-      <w:r>
-        <w:rPr>
-          <w:rFonts w:hint="eastAsia"/>
-        </w:rPr>
-        <w:t xml:space="preserve">“两杠杆均关”</w:t>
-      </w:r>
-      <w:r>
-        <w:rPr>
-          <w:rFonts w:hint="eastAsia"/>
-        </w:rPr>
-        <w:t xml:space="preserve">为基线（55/75），单开</w:t>
-      </w:r>
-      <w:r>
-        <w:t xml:space="preserve"> testId </w:t>
-      </w:r>
-      <w:r>
-        <w:rPr>
-          <w:rFonts w:hint="eastAsia"/>
-        </w:rPr>
-        <w:t xml:space="preserve">加权检索与单开强锚点过滤各带来</w:t>
-      </w:r>
-      <w:r>
-        <w:t xml:space="preserve"> +2 </w:t>
-      </w:r>
-      <w:r>
-        <w:rPr>
-          <w:rFonts w:hint="eastAsia"/>
-        </w:rPr>
-        <w:t xml:space="preserve">个精确匹配，两者全开合计</w:t>
-      </w:r>
-      <w:r>
-        <w:t xml:space="preserve"> </w:t>
-      </w:r>
-      <w:r>
-        <w:rPr>
-          <w:rFonts w:hint="eastAsia"/>
-        </w:rPr>
-        <w:t xml:space="preserve">+3、且</w:t>
-      </w:r>
-      <w:r>
-        <w:rPr>
-          <w:rFonts w:hint="eastAsia"/>
-          <w:i/>
-          <w:iCs/>
-        </w:rPr>
-        <w:t xml:space="preserve">零回归</w:t>
-      </w:r>
-      <w:r>
-        <w:rPr>
-          <w:rFonts w:hint="eastAsia"/>
-        </w:rPr>
-        <w:t xml:space="preserve">。须如实说明：这些增益方向一致、无一造成回归，但在</w:t>
-      </w:r>
-      <w:r>
-        <w:t xml:space="preserve"> </w:t>
+        <w:rPr>
+          <w:rFonts w:hint="eastAsia"/>
+        </w:rPr>
+        <w:t xml:space="preserve"> 下均未达 </w:t>
       </w:r>
       <ns1:oMath>
-        <ns1:r>
-          <ns1:t>n</ns1:t>
-        </ns1:r>
         <ns1:r>
           <ns1:rPr>
             <ns1:sty ns1:val="p"/>
           </ns1:rPr>
-          <ns1:t>=</ns1:t>
+          <ns1:t>p</ns1:t>
         </ns1:r>
         <ns1:r>
-          <ns1:t>75</ns1:t>
+          <ns1:t>&lt;0.05</ns1:t>
         </ns1:r>
       </ns1:oMath>
       <w:r>
-        <w:t xml:space="preserve"> </w:t>
-      </w:r>
-      <w:r>
-        <w:rPr>
-          <w:rFonts w:hint="eastAsia"/>
-        </w:rPr>
-        <w:t xml:space="preserve">的样本量下经</w:t>
-      </w:r>
-      <w:r>
-        <w:t xml:space="preserve"> McNemar </w:t>
-      </w:r>
-      <w:r>
-        <w:rPr>
-          <w:rFonts w:hint="eastAsia"/>
-        </w:rPr>
-        <w:t xml:space="preserve">精确检验均</w:t>
+        <w:rPr>
+          <w:rFonts w:hint="eastAsia"/>
+        </w:rPr>
+        <w:t xml:space="preserve">。</w:t>
+      </w:r>
+    </w:p>
+    <w:bookmarkEnd w:id="39"/>
+    <w:bookmarkStart w:id="40" w:name="解读-1"/>
+    <w:p>
+      <w:pPr>
+        <w:pStyle w:val="Heading3"/>
+      </w:pPr>
+      <w:r>
+        <w:t xml:space="preserve">3.4.3解读</w:t>
+      </w:r>
+    </w:p>
+    <w:p>
+      <w:pPr>
+        <w:pStyle w:val="FirstParagraph"/>
+      </w:pPr>
+      <w:r>
+        <w:rPr>
+          <w:rFonts w:hint="eastAsia"/>
+        </w:rPr>
+        <w:t xml:space="preserve">两项手段均开销较低、完全确定性、无需任何模型再训练。借助表 5 的二因子析因可分离两者贡献：在 Qwen 上，以“两杠杆均关”为基线（55/75），单开 testId 加权检索与单开强锚点过滤各带来 +2 个精确匹配，两者全开合计 +3、且</w:t>
       </w:r>
       <w:r>
         <w:rPr>
@@ -5658,45 +5830,89 @@
           <w:i/>
           <w:iCs/>
         </w:rPr>
-        <w:t xml:space="preserve">未达统计显著</w:t>
-      </w:r>
-      <w:r>
-        <w:rPr>
-          <w:rFonts w:hint="eastAsia"/>
-        </w:rPr>
-        <w:t xml:space="preserve">（</w:t>
+        <w:t xml:space="preserve">零回归</w:t>
+      </w:r>
+      <w:r>
+        <w:rPr>
+          <w:rFonts w:hint="eastAsia"/>
+        </w:rPr>
+        <w:t xml:space="preserve">。须如实说明：这些增益方向一致、无一造成回归，但在 </w:t>
       </w:r>
       <ns1:oMath>
-        <ns1:r>
-          <ns1:t>p</ns1:t>
-        </ns1:r>
         <ns1:r>
           <ns1:rPr>
             <ns1:sty ns1:val="p"/>
           </ns1:rPr>
-          <ns1:t>≥</ns1:t>
+          <ns1:t>n</ns1:t>
         </ns1:r>
         <ns1:r>
-          <ns1:t>0.25</ns1:t>
+          <ns1:t>=75</ns1:t>
         </ns1:r>
       </ns1:oMath>
       <w:r>
         <w:rPr>
           <w:rFonts w:hint="eastAsia"/>
         </w:rPr>
-        <w:t xml:space="preserve">）；因此我们把它们定位为</w:t>
-      </w:r>
-      <w:r>
-        <w:rPr>
-          <w:rFonts w:hint="eastAsia"/>
-        </w:rPr>
-        <w:t xml:space="preserve">“低开销、零回归的确定性工程杠杆”</w:t>
-      </w:r>
-      <w:r>
-        <w:rPr>
-          <w:rFonts w:hint="eastAsia"/>
-        </w:rPr>
-        <w:t xml:space="preserve">，而非已被统计确立的性能提升。</w:t>
+        <w:t xml:space="preserve"> 的样本量下经 McNemar 精确检验均</w:t>
+      </w:r>
+      <w:r>
+        <w:rPr>
+          <w:rFonts w:hint="eastAsia"/>
+          <w:i/>
+          <w:iCs/>
+        </w:rPr>
+        <w:t xml:space="preserve">未达统计显著</w:t>
+      </w:r>
+      <w:r>
+        <w:rPr>
+          <w:rFonts w:hint="eastAsia"/>
+        </w:rPr>
+        <w:t xml:space="preserve">（</w:t>
+      </w:r>
+      <ns1:oMath>
+        <ns1:r>
+          <ns1:rPr>
+            <ns1:sty ns1:val="p"/>
+          </ns1:rPr>
+          <ns1:t>p</ns1:t>
+        </ns1:r>
+        <ns1:r>
+          <ns1:t>≥0.25</ns1:t>
+        </ns1:r>
+      </ns1:oMath>
+      <w:r>
+        <w:rPr>
+          <w:rFonts w:hint="eastAsia"/>
+        </w:rPr>
+        <w:t xml:space="preserve">）；因此我们把它们定位为“低开销、零回归的确定性工程杠杆”，而非已被统计确立的性能提升。</w:t>
+      </w:r>
+    </w:p>
+    <w:p>
+      <w:pPr>
+        <w:pStyle w:val="BodyText"/>
+      </w:pPr>
+      <w:r>
+        <w:rPr>
+          <w:rFonts w:hint="eastAsia"/>
+        </w:rPr>
+        <w:t xml:space="preserve">DeepSeek 复现使这一结论从“两杠杆叠加”收缩为“后置过滤是更可迁移的部分”。在 DeepSeek 上，仅后置过滤带来 +4/-0（72/75）的零回归增益，而 testId 加权是 +5/-5 的净零交换，且与过滤同开时（69/75）反而低于仅过滤（72/75，配对 +1/-4，</w:t>
+      </w:r>
+      <ns1:oMath>
+        <ns1:r>
+          <ns1:rPr>
+            <ns1:sty ns1:val="p"/>
+          </ns1:rPr>
+          <ns1:t>p</ns1:t>
+        </ns1:r>
+        <ns1:r>
+          <ns1:t>=0.375</ns1:t>
+        </ns1:r>
+      </ns1:oMath>
+      <w:r>
+        <w:rPr>
+          <w:rFonts w:hint="eastAsia"/>
+        </w:rPr>
+        <w:t xml:space="preserve">）。一种解释是加权会重排候选顺序，从而改变生成式修复器的选择；当后置过滤已经剔除弱锚点候选时，这种重排不再带来稳定收益。该解释只是假设，本文未对候选顺序做受控消融。此外，API 服务端并不承诺逐位确定性，臂间 1–3 例的差异也可能混有运行间噪声。故我们不宣称确定性杠杆具有跨模型可加性：后置过滤作为不依赖模型偏好的输出约束更稳健，而加权检索的收益依赖底层模型与候选分布；所有差异均未达显著，以上仅作为工程线索。</w:t>
       </w:r>
     </w:p>
     <w:bookmarkEnd w:id="40"/>
@@ -6473,199 +6689,53 @@
         <w:pStyle w:val="FirstParagraph"/>
       </w:pPr>
       <w:r>
-        <w:t xml:space="preserve">Qwen </w:t>
-      </w:r>
-      <w:r>
-        <w:rPr>
-          <w:rFonts w:hint="eastAsia"/>
-        </w:rPr>
-        <w:t xml:space="preserve">的</w:t>
-      </w:r>
-      <w:r>
-        <w:t xml:space="preserve"> </w:t>
-      </w:r>
-      <w:r>
-        <w:rPr>
-          <w:smallCaps/>
-        </w:rPr>
-        <w:t xml:space="preserve">Vanilla</w:t>
-      </w:r>
-      <w:r>
-        <w:t xml:space="preserve"> </w:t>
-      </w:r>
-      <w:r>
-        <w:rPr>
-          <w:rFonts w:hint="eastAsia"/>
-        </w:rPr>
-        <w:t xml:space="preserve">与</w:t>
-      </w:r>
-      <w:r>
-        <w:t xml:space="preserve"> </w:t>
-      </w:r>
-      <w:r>
-        <w:rPr>
-          <w:smallCaps/>
-        </w:rPr>
-        <w:t xml:space="preserve">Abstain</w:t>
-      </w:r>
-      <w:r>
-        <w:t xml:space="preserve"> </w:t>
-      </w:r>
-      <w:r>
-        <w:rPr>
-          <w:rFonts w:hint="eastAsia"/>
-        </w:rPr>
-        <w:t xml:space="preserve">两种提示之间逐例完全等同（表</w:t>
-      </w:r>
-      <w:r>
-        <w:t xml:space="preserve"> </w:t>
-      </w:r>
-      <w:r>
-        <w:rPr>
-          <w:rFonts w:hint="eastAsia"/>
-        </w:rPr>
-        <w:t xml:space="preserve">2），说明小型本地代码模型并未把</w:t>
-      </w:r>
-      <w:r>
-        <w:rPr>
-          <w:rFonts w:hint="eastAsia"/>
-        </w:rPr>
-        <w:t xml:space="preserve">“必要时放弃”</w:t>
-      </w:r>
-      <w:r>
-        <w:rPr>
-          <w:rFonts w:hint="eastAsia"/>
-        </w:rPr>
-        <w:t xml:space="preserve">的软指令转化为可观察行为。GPT-4o</w:t>
-      </w:r>
-      <w:r>
-        <w:t xml:space="preserve"> </w:t>
-      </w:r>
-      <w:r>
-        <w:rPr>
-          <w:rFonts w:hint="eastAsia"/>
-        </w:rPr>
-        <w:t xml:space="preserve">的结果更复杂：放弃提示将误修复从</w:t>
-      </w:r>
-      <w:r>
-        <w:t xml:space="preserve"> 63/75 </w:t>
-      </w:r>
-      <w:r>
-        <w:rPr>
-          <w:rFonts w:hint="eastAsia"/>
-        </w:rPr>
-        <w:t xml:space="preserve">降至</w:t>
-      </w:r>
-      <w:r>
-        <w:t xml:space="preserve"> </w:t>
-      </w:r>
-      <w:r>
-        <w:rPr>
-          <w:rFonts w:hint="eastAsia"/>
-        </w:rPr>
-        <w:t xml:space="preserve">51/75，但残留误修复仍占</w:t>
-      </w:r>
-      <w:r>
-        <w:t xml:space="preserve"> </w:t>
-      </w:r>
-      <w:r>
-        <w:rPr>
-          <w:rFonts w:hint="eastAsia"/>
-        </w:rPr>
-        <w:t xml:space="preserve">68.0%。一种可能的解释是，软指令需与</w:t>
-      </w:r>
-      <w:r>
-        <w:rPr>
-          <w:rFonts w:hint="eastAsia"/>
-        </w:rPr>
-        <w:t xml:space="preserve">“生成合理输出”</w:t>
-      </w:r>
-      <w:r>
-        <w:rPr>
-          <w:rFonts w:hint="eastAsia"/>
-        </w:rPr>
-        <w:t xml:space="preserve">这一更强先验竞争，且模型越强越可能部分遵守该指令（此为机理层面的推测，本文未做训练动力学层面的验证）。对工具设计的启示仍然清晰：反误修复的安全保障必须可审计地置于模型</w:t>
-      </w:r>
+        <w:rPr>
+          <w:rFonts w:hint="eastAsia"/>
+        </w:rPr>
+        <w:t xml:space="preserve">Qwen 的 Vanilla 与 Abstain 两种提示之间逐例完全等同（表 2），说明小型本地代码模型并未把“必要时放弃”的软指令转化为可观察行为。两个 API 模型的结果更复杂：放弃提示将 GPT-4o 的误修复从 63/75 降至 51/75（84.0%→68.0%），将 DeepSeek 的误修复从 60/75 降至 53/75（80.0%→70.7%），但残留误修复仍分别占 68.0% 与 70.7%。一种可能的解释是，软指令需与“生成合理输出”这一更强先验竞争，且模型越强越可能部分遵守该指令（此为机理层面的推测，本文未做训练动力学层面的验证）。对工具设计的启示仍然清晰：反误修复的安全保障必须可审计地置于模型之外，例如确定性的检索分数阈值、锚点类别归属规则，以及一个能够证伪通过补丁的行为验证器。</w:t>
+      </w:r>
+    </w:p>
+    <w:bookmarkEnd w:id="48"/>
+    <w:bookmarkStart w:id="49" w:name="确定性杠杆的有限含义"/>
+    <w:p>
+      <w:pPr>
+        <w:pStyle w:val="Heading2"/>
+      </w:pPr>
+      <w:r>
+        <w:t xml:space="preserve">4.3确定性杠杆的有限含义</w:t>
+      </w:r>
+    </w:p>
+    <w:p>
+      <w:pPr>
+        <w:pStyle w:val="FirstParagraph"/>
+      </w:pPr>
+      <w:r>
+        <w:rPr>
+          <w:rFonts w:hint="eastAsia"/>
+        </w:rPr>
+        <w:t xml:space="preserve">F2 不构成具有统计学显著性的性能结论。它在 Qwen 上给出一条低开销、零回归的工程线索：当系统知道某类锚点更稳定时，把约束放进候选检索与输出后置过滤，比只要求模型“优先考虑稳定锚点”更可审计。但 DeepSeek 的 2×2 复现只部分支持这一线索：强锚点后置过滤在两种模型上都保持零回归增益（Qwen +2/-0，DeepSeek +4/-0），而 testId 加权在 DeepSeek 上为 +5/-5 的净零交换，且与过滤同开时低于仅过滤。因此更稳妥的工程结论是：可审计的输出后置过滤比候选排序更具跨模型可迁移性；加权检索的收益依赖底层模型与候选分布。该解释仍属假设，本文未对候选顺序做受控消融，且所有差异均未达显著。本文据此把 F2 作为辅助性经验，而非主要科学贡献。</w:t>
+      </w:r>
+    </w:p>
+    <w:bookmarkEnd w:id="49"/>
+    <w:bookmarkStart w:id="50" w:name="局限"/>
+    <w:p>
+      <w:pPr>
+        <w:pStyle w:val="Heading2"/>
+      </w:pPr>
+      <w:r>
+        <w:t xml:space="preserve">4.4局限</w:t>
+      </w:r>
+    </w:p>
+    <w:p>
+      <w:pPr>
+        <w:pStyle w:val="FirstParagraph"/>
+      </w:pPr>
       <w:r>
         <w:rPr>
           <w:rFonts w:hint="eastAsia"/>
           <w:i/>
           <w:iCs/>
         </w:rPr>
-        <w:t xml:space="preserve">之外</w:t>
-      </w:r>
-      <w:r>
-        <w:rPr>
-          <w:rFonts w:hint="eastAsia"/>
-        </w:rPr>
-        <w:t xml:space="preserve">，例如确定性的检索分数阈值、锚点类别归属规则，以及一个能够证伪通过补丁的行为验证器。</w:t>
-      </w:r>
-    </w:p>
-    <w:bookmarkEnd w:id="48"/>
-    <w:bookmarkStart w:id="49" w:name="确定性杠杆的有限含义"/>
-    <w:p>
-      <w:pPr>
-        <w:pStyle w:val="Heading2"/>
-      </w:pPr>
-      <w:r>
-        <w:t xml:space="preserve">4.3确定性杠杆的有限含义</w:t>
-      </w:r>
-    </w:p>
-    <w:p>
-      <w:pPr>
-        <w:pStyle w:val="FirstParagraph"/>
-      </w:pPr>
-      <w:r>
-        <w:t xml:space="preserve">F2 </w:t>
-      </w:r>
-      <w:r>
-        <w:rPr>
-          <w:rFonts w:hint="eastAsia"/>
-        </w:rPr>
-        <w:t xml:space="preserve">不构成具有统计学显著性的性能结论。它的价值在于给出一条低开销、零回归的工程线索：当系统知道某类锚点更稳定时，把约束放进候选检索与输出后置过滤，比只要求模型</w:t>
-      </w:r>
-      <w:r>
-        <w:rPr>
-          <w:rFonts w:hint="eastAsia"/>
-        </w:rPr>
-        <w:t xml:space="preserve">“优先考虑稳定锚点”</w:t>
-      </w:r>
-      <w:r>
-        <w:rPr>
-          <w:rFonts w:hint="eastAsia"/>
-        </w:rPr>
-        <w:t xml:space="preserve">更可审计。本文据此把</w:t>
-      </w:r>
-      <w:r>
-        <w:t xml:space="preserve"> F2 </w:t>
-      </w:r>
-      <w:r>
-        <w:rPr>
-          <w:rFonts w:hint="eastAsia"/>
-        </w:rPr>
-        <w:t xml:space="preserve">作为辅助性经验，而非主要科学贡献。</w:t>
-      </w:r>
-    </w:p>
-    <w:bookmarkEnd w:id="49"/>
-    <w:bookmarkStart w:id="50" w:name="局限"/>
-    <w:p>
-      <w:pPr>
-        <w:pStyle w:val="Heading2"/>
-      </w:pPr>
-      <w:r>
-        <w:t xml:space="preserve">4.4局限</w:t>
-      </w:r>
-    </w:p>
-    <w:p>
-      <w:pPr>
-        <w:pStyle w:val="FirstParagraph"/>
-      </w:pPr>
-      <w:r>
-        <w:rPr>
-          <w:rFonts w:hint="eastAsia"/>
-          <w:i/>
-          <w:iCs/>
-        </w:rPr>
         <w:t xml:space="preserve">模型范围。</w:t>
       </w:r>
       <w:r>
@@ -6696,7 +6766,7 @@
         <w:rPr>
           <w:rStyle w:val="VerbatimChar"/>
         </w:rPr>
-        <w:t xml:space="preserve">gpt-4o</w:t>
+        <w:t xml:space="preserve">gpt-4o 与 deepseek-v4-flash</w:t>
       </w:r>
       <w:r>
         <w:t xml:space="preserve"> </w:t>
@@ -6729,13 +6799,13 @@
         <w:t xml:space="preserve">：结果显示</w:t>
       </w:r>
       <w:r>
-        <w:t xml:space="preserve"> GPT-4o </w:t>
-      </w:r>
-      <w:r>
-        <w:rPr>
-          <w:rFonts w:hint="eastAsia"/>
-        </w:rPr>
-        <w:t xml:space="preserve">确能把误修复从</w:t>
+        <w:t xml:space="preserve"> GPT-4o 与 DeepSeek </w:t>
+      </w:r>
+      <w:r>
+        <w:rPr>
+          <w:rFonts w:hint="eastAsia"/>
+        </w:rPr>
+        <w:t xml:space="preserve">分别能把误修复从</w:t>
       </w:r>
       <w:r>
         <w:t xml:space="preserve"> 84.0% </w:t>
@@ -6753,7 +6823,7 @@
         <w:rPr>
           <w:rFonts w:hint="eastAsia"/>
         </w:rPr>
-        <w:t xml:space="preserve">68.0%，但仍不能把风险降到可无人值守接受的水平。该结论仍只覆盖一个前沿模型、一个数据集与一次贪心解码设置；因此本文不声称已穷尽模型规模、训练方式或供应商差异。</w:t>
+        <w:t xml:space="preserve">68.0%、从 80.0% 降至 70.7%，但仍不能把风险降到可无人值守接受的水平。F2 的 2×2 四臂也已在 DeepSeek 上复现，但两个模型均只做单次贪心采样，且 DeepSeek 的臂间差异同时包含候选重排效应与潜在的服务端非确定性，本文无法将二者分离。该结论仍只覆盖两个 API 模型、一个数据集与一次解码设置；因此本文不声称已穷尽模型规模、训练方式或供应商差异。</w:t>
       </w:r>
       <w:r>
         <w:t xml:space="preserve"> </w:t>
@@ -7360,16 +7430,16 @@
         <w:rPr>
           <w:rStyle w:val="VerbatimChar"/>
         </w:rPr>
-        <w:t xml:space="preserve">gpt-4o</w:t>
-      </w:r>
-      <w:r>
-        <w:t xml:space="preserve"> </w:t>
-      </w:r>
-      <w:r>
-        <w:rPr>
-          <w:rFonts w:hint="eastAsia"/>
-        </w:rPr>
-        <w:t xml:space="preserve">能将误修复从</w:t>
+        <w:t xml:space="preserve">gpt-4o 与 deepseek-v4-flash</w:t>
+      </w:r>
+      <w:r>
+        <w:t xml:space="preserve"> </w:t>
+      </w:r>
+      <w:r>
+        <w:rPr>
+          <w:rFonts w:hint="eastAsia"/>
+        </w:rPr>
+        <w:t xml:space="preserve">分别能将误修复从</w:t>
       </w:r>
       <w:r>
         <w:t xml:space="preserve"> 84.0% </w:t>
@@ -7387,7 +7457,7 @@
         <w:rPr>
           <w:rFonts w:hint="eastAsia"/>
         </w:rPr>
-        <w:t xml:space="preserve">68.0%，但仍留下多数错误可解析补丁。HealReact</w:t>
+        <w:t xml:space="preserve">68.0%、从 80.0% 降至 70.7%，但均留下多数错误可解析补丁。HealReact</w:t>
       </w:r>
       <w:r>
         <w:t xml:space="preserve"> </w:t>
@@ -7441,7 +7511,7 @@
         <w:rPr>
           <w:rFonts w:hint="eastAsia"/>
         </w:rPr>
-        <w:t xml:space="preserve">77.3%；两个低开销确定性手段进一步给出了零回归但统计未显著的局部改进。三项结果合起来，为后续工作中评估行为重放验证器给出了直接的经验性动机，也给出了一条由锚点文化差异所限制的、可证伪的跨应用泛化假设。</w:t>
+        <w:t xml:space="preserve">77.3%；两个低开销确定性手段给出了统计未显著、且构成依赖底层模型的局部改进——强锚点后置过滤在 Qwen 与 DeepSeek 上均零回归，testId 加权则未在 DeepSeek 上复现净增益。三项结果合起来，为后续工作中评估行为重放验证器给出了直接的经验性动机，也给出了一条由锚点文化差异所限制的、可证伪的跨应用泛化假设。</w:t>
       </w:r>
     </w:p>
     <w:bookmarkEnd w:id="54"/>

</xml_diff>

<commit_message>
paper-zh-journal-ids: 全文中文表达润色并同步 Word 稿
- 按 humanizer-zh 与 lieflat-less-ai-tone 规则处理翻案腔、破折号、
  提示语冒号、“当……时”前置从句、段首连接词等表达问题
- 保留全部数字、引用、限定词与论证结构；数字与引用经脚本核对一致
- 同步 DOCX 正文与 F2 模型泛化说明，保留原生表格与 OMML 公式

Co-Authored-By: Claude Code <noreply@anthropic.com>
</commit_message>
<xml_diff>
--- a/paper-zh-journal-ids/Playwright 测试自愈隐性误修复实证研究.docx
+++ b/paper-zh-journal-ids/Playwright 测试自愈隐性误修复实证研究.docx
@@ -184,25 +184,31 @@
         <w:rPr>
           <w:rFonts w:hint="eastAsia"/>
         </w:rPr>
-        <w:t xml:space="preserve">维护脆弱的用户界面（User</w:t>
-      </w:r>
-      <w:r>
-        <w:t xml:space="preserve"> </w:t>
-      </w:r>
-      <w:r>
-        <w:rPr>
-          <w:rFonts w:hint="eastAsia"/>
-        </w:rPr>
-        <w:t xml:space="preserve">Interface，UI）测试套件是现代</w:t>
-      </w:r>
-      <w:r>
-        <w:t xml:space="preserve"> Web </w:t>
-      </w:r>
-      <w:r>
-        <w:rPr>
-          <w:rFonts w:hint="eastAsia"/>
-        </w:rPr>
-        <w:t xml:space="preserve">工程中持续存在的维护成本。一次层叠样式表（Cascading</w:t>
+        <w:t xml:space="preserve">脆弱的用户界面（User Interface，UI）测试套件给现代 Web 工程带来了持续的维护成本。</w:t>
+      </w:r>
+      <w:r>
+        <w:rPr>
+          <w:rFonts w:hint="eastAsia"/>
+        </w:rPr>
+        <w:t xml:space="preserve"/>
+      </w:r>
+      <w:r>
+        <w:rPr>
+          <w:rFonts w:hint="eastAsia"/>
+        </w:rPr>
+        <w:t xml:space="preserve"/>
+      </w:r>
+      <w:r>
+        <w:rPr>
+          <w:rFonts w:hint="eastAsia"/>
+        </w:rPr>
+        <w:t xml:space="preserve"/>
+      </w:r>
+      <w:r>
+        <w:rPr>
+          <w:rFonts w:hint="eastAsia"/>
+        </w:rPr>
+        <w:t xml:space="preserve">一次层叠样式表（Cascading</w:t>
       </w:r>
       <w:r>
         <w:t xml:space="preserve"> Style </w:t>
@@ -284,6 +290,122 @@
           <w:rFonts w:hint="eastAsia"/>
         </w:rPr>
         <w:t xml:space="preserve">，给出的自然回应都是</w:t>
+      </w:r>
+      <w:r>
+        <w:rPr>
+          <w:rFonts w:hint="eastAsia"/>
+        </w:rPr>
+        <w:t xml:space="preserve">自愈：在</w:t>
+      </w:r>
+      <w:r>
+        <w:rPr>
+          <w:rFonts w:hint="eastAsia"/>
+        </w:rPr>
+        <w:t xml:space="preserve"/>
+      </w:r>
+      <w:r>
+        <w:rPr>
+          <w:rFonts w:hint="eastAsia"/>
+        </w:rPr>
+        <w:t xml:space="preserve">定位器失效时，自动将其重写为指向新文档对象模型（Document</w:t>
+      </w:r>
+      <w:r>
+        <w:t xml:space="preserve"> Object </w:t>
+      </w:r>
+      <w:r>
+        <w:rPr>
+          <w:rFonts w:hint="eastAsia"/>
+        </w:rPr>
+        <w:t xml:space="preserve">Model，DOM）中等价元素的形式。近年来，大语言模型（LLM）被广泛引入软件测试与修复任务</w:t>
+      </w:r>
+      <w:r>
+        <w:t xml:space="preserve"> </w:t>
+      </w:r>
+      <w:r>
+        <w:rPr>
+          <w:vertAlign w:val="superscript"/>
+        </w:rPr>
+        <w:t xml:space="preserve">[6,7]</w:t>
+      </w:r>
+      <w:r>
+        <w:rPr>
+          <w:rFonts w:hint="eastAsia"/>
+        </w:rPr>
+        <w:t xml:space="preserve">，自动测试修复（含定位器修复）是其中最直接受益的方向之一。</w:t>
+      </w:r>
+    </w:p>
+    <w:p>
+      <w:pPr>
+        <w:pStyle w:val="BodyText"/>
+      </w:pPr>
+      <w:r>
+        <w:rPr>
+          <w:rFonts w:hint="eastAsia"/>
+        </w:rPr>
+        <w:t xml:space="preserve">近期文献使这一问题看起来接近解决。</w:t>
+      </w:r>
+      <w:r>
+        <w:rPr>
+          <w:rFonts w:hint="eastAsia"/>
+        </w:rPr>
+        <w:t xml:space="preserve">Joseph</w:t>
+      </w:r>
+      <w:r>
+        <w:t xml:space="preserve"> </w:t>
+      </w:r>
+      <w:r>
+        <w:rPr>
+          <w:vertAlign w:val="superscript"/>
+        </w:rPr>
+        <w:t xml:space="preserve">[4]</w:t>
+      </w:r>
+      <w:r>
+        <w:t xml:space="preserve"> </w:t>
+      </w:r>
+      <w:r>
+        <w:rPr>
+          <w:rFonts w:hint="eastAsia"/>
+        </w:rPr>
+        <w:t xml:space="preserve">通过一个确定性可访问性阶梯在单一</w:t>
+      </w:r>
+      <w:r>
+        <w:t xml:space="preserve"> demo </w:t>
+      </w:r>
+      <w:r>
+        <w:rPr>
+          <w:rFonts w:hint="eastAsia"/>
+        </w:rPr>
+        <w:t xml:space="preserve">上报告了</w:t>
+      </w:r>
+      <w:r>
+        <w:t xml:space="preserve"> 100% </w:t>
+      </w:r>
+      <w:r>
+        <w:rPr>
+          <w:rFonts w:hint="eastAsia"/>
+        </w:rPr>
+        <w:t xml:space="preserve">通过率；当代基于</w:t>
+      </w:r>
+      <w:r>
+        <w:t xml:space="preserve"> LLM </w:t>
+      </w:r>
+      <w:r>
+        <w:rPr>
+          <w:rFonts w:hint="eastAsia"/>
+        </w:rPr>
+        <w:t xml:space="preserve">的定位器修复工作通常借助一致性守门规则报告修复成功率或解释一致性。然而这些指标共享一处</w:t>
+      </w:r>
+      <w:r>
+        <w:rPr>
+          <w:rFonts w:hint="eastAsia"/>
+        </w:rPr>
+        <w:t xml:space="preserve">结构性盲区。它们</w:t>
+      </w:r>
+      <w:r>
+        <w:rPr>
+          <w:rFonts w:hint="eastAsia"/>
+        </w:rPr>
+        <w:t xml:space="preserve">衡量的是</w:t>
       </w:r>
       <w:r>
         <w:rPr>
@@ -291,96 +413,13 @@
           <w:i/>
           <w:iCs/>
         </w:rPr>
-        <w:t xml:space="preserve">自愈</w:t>
-      </w:r>
-      <w:r>
-        <w:t xml:space="preserve">: </w:t>
-      </w:r>
-      <w:r>
-        <w:rPr>
-          <w:rFonts w:hint="eastAsia"/>
-        </w:rPr>
-        <w:t xml:space="preserve">在定位器失效时，自动将其重写为指向新文档对象模型（Document</w:t>
-      </w:r>
-      <w:r>
-        <w:t xml:space="preserve"> Object </w:t>
-      </w:r>
-      <w:r>
-        <w:rPr>
-          <w:rFonts w:hint="eastAsia"/>
-        </w:rPr>
-        <w:t xml:space="preserve">Model，DOM）中等价元素的形式。近年来，大语言模型（LLM）被广泛引入软件测试与修复任务</w:t>
-      </w:r>
-      <w:r>
-        <w:t xml:space="preserve"> </w:t>
-      </w:r>
-      <w:r>
-        <w:rPr>
-          <w:vertAlign w:val="superscript"/>
-        </w:rPr>
-        <w:t xml:space="preserve">[6,7]</w:t>
-      </w:r>
-      <w:r>
-        <w:rPr>
-          <w:rFonts w:hint="eastAsia"/>
-        </w:rPr>
-        <w:t xml:space="preserve">，自动测试修复（含定位器修复）是其中最直接受益的方向之一。</w:t>
-      </w:r>
-    </w:p>
-    <w:p>
-      <w:pPr>
-        <w:pStyle w:val="BodyText"/>
-      </w:pPr>
-      <w:r>
-        <w:rPr>
-          <w:rFonts w:hint="eastAsia"/>
-        </w:rPr>
-        <w:t xml:space="preserve">这一前景看似乐观，近期文献也使该问题看起来接近解决。Joseph</w:t>
-      </w:r>
-      <w:r>
-        <w:t xml:space="preserve"> </w:t>
-      </w:r>
-      <w:r>
-        <w:rPr>
-          <w:vertAlign w:val="superscript"/>
-        </w:rPr>
-        <w:t xml:space="preserve">[4]</w:t>
-      </w:r>
-      <w:r>
-        <w:t xml:space="preserve"> </w:t>
-      </w:r>
-      <w:r>
-        <w:rPr>
-          <w:rFonts w:hint="eastAsia"/>
-        </w:rPr>
-        <w:t xml:space="preserve">通过一个确定性可访问性阶梯在单一</w:t>
-      </w:r>
-      <w:r>
-        <w:t xml:space="preserve"> demo </w:t>
-      </w:r>
-      <w:r>
-        <w:rPr>
-          <w:rFonts w:hint="eastAsia"/>
-        </w:rPr>
-        <w:t xml:space="preserve">上报告了</w:t>
-      </w:r>
-      <w:r>
-        <w:t xml:space="preserve"> 100% </w:t>
-      </w:r>
-      <w:r>
-        <w:rPr>
-          <w:rFonts w:hint="eastAsia"/>
-        </w:rPr>
-        <w:t xml:space="preserve">通过率；当代基于</w:t>
-      </w:r>
-      <w:r>
-        <w:t xml:space="preserve"> LLM </w:t>
-      </w:r>
-      <w:r>
-        <w:rPr>
-          <w:rFonts w:hint="eastAsia"/>
-        </w:rPr>
-        <w:t xml:space="preserve">的定位器修复工作通常借助一致性守门规则报告修复成功率或解释一致性。然而这些指标共享一处结构性盲区：它们衡量的是</w:t>
+        <w:t xml:space="preserve">打过补丁的测试是否通过</w:t>
+      </w:r>
+      <w:r>
+        <w:rPr>
+          <w:rFonts w:hint="eastAsia"/>
+        </w:rPr>
+        <w:t xml:space="preserve">，而非</w:t>
       </w:r>
       <w:r>
         <w:rPr>
@@ -388,60 +427,55 @@
           <w:i/>
           <w:iCs/>
         </w:rPr>
-        <w:t xml:space="preserve">打过补丁的测试是否通过</w:t>
-      </w:r>
-      <w:r>
-        <w:rPr>
-          <w:rFonts w:hint="eastAsia"/>
-        </w:rPr>
-        <w:t xml:space="preserve">，而非</w:t>
-      </w:r>
-      <w:r>
-        <w:rPr>
-          <w:rFonts w:hint="eastAsia"/>
-          <w:i/>
-          <w:iCs/>
-        </w:rPr>
         <w:t xml:space="preserve">补丁是否指向开发者真正期望的元素</w:t>
       </w:r>
       <w:r>
         <w:rPr>
           <w:rFonts w:hint="eastAsia"/>
         </w:rPr>
-        <w:t xml:space="preserve">。一个总能找到</w:t>
-      </w:r>
-      <w:r>
-        <w:rPr>
-          <w:rFonts w:hint="eastAsia"/>
-        </w:rPr>
-        <w:t xml:space="preserve">“某个”</w:t>
-      </w:r>
-      <w:r>
-        <w:rPr>
-          <w:rFonts w:hint="eastAsia"/>
-        </w:rPr>
-        <w:t xml:space="preserve">可解析选择器（任何属性近似的元素皆可）的修复器存在隐蔽的危险性——每一次</w:t>
-      </w:r>
-      <w:r>
-        <w:rPr>
-          <w:rFonts w:hint="eastAsia"/>
-        </w:rPr>
-        <w:t xml:space="preserve">“通过但错指”</w:t>
-      </w:r>
-      <w:r>
-        <w:rPr>
-          <w:rFonts w:hint="eastAsia"/>
-        </w:rPr>
-        <w:t xml:space="preserve">的修复都会掩盖一次本应被作为回归暴露的真实</w:t>
-      </w:r>
-      <w:r>
-        <w:t xml:space="preserve"> UI </w:t>
-      </w:r>
-      <w:r>
-        <w:rPr>
-          <w:rFonts w:hint="eastAsia"/>
-        </w:rPr>
-        <w:t xml:space="preserve">变更。</w:t>
+        <w:t xml:space="preserve">。</w:t>
+      </w:r>
+      <w:r>
+        <w:rPr>
+          <w:rFonts w:hint="eastAsia"/>
+        </w:rPr>
+        <w:t xml:space="preserve">一个修复器只要能找到“某个”可解析选择器（任何属性近似的元素皆可），就存在隐蔽危险：每一次“通过但错指”的修复都会掩盖一次本应作为回归暴露的真实 UI 变更。</w:t>
+      </w:r>
+      <w:r>
+        <w:rPr>
+          <w:rFonts w:hint="eastAsia"/>
+        </w:rPr>
+        <w:t xml:space="preserve"/>
+      </w:r>
+      <w:r>
+        <w:rPr>
+          <w:rFonts w:hint="eastAsia"/>
+        </w:rPr>
+        <w:t xml:space="preserve"/>
+      </w:r>
+      <w:r>
+        <w:rPr>
+          <w:rFonts w:hint="eastAsia"/>
+        </w:rPr>
+        <w:t xml:space="preserve"/>
+      </w:r>
+      <w:r>
+        <w:rPr>
+          <w:rFonts w:hint="eastAsia"/>
+        </w:rPr>
+        <w:t xml:space="preserve"/>
+      </w:r>
+      <w:r>
+        <w:rPr>
+          <w:rFonts w:hint="eastAsia"/>
+        </w:rPr>
+        <w:t xml:space="preserve"/>
+      </w:r>
+      <w:r>
+        <w:rPr>
+          <w:rFonts w:hint="eastAsia"/>
+        </w:rPr>
+        <w:t xml:space="preserve"/>
       </w:r>
     </w:p>
     <w:p>
@@ -497,7 +531,13 @@
         <w:rPr>
           <w:rFonts w:hint="eastAsia"/>
         </w:rPr>
-        <w:t xml:space="preserve">个可达失效用例上，结果令人不安:</w:t>
+        <w:t xml:space="preserve">个可达失效用例上，</w:t>
+      </w:r>
+      <w:r>
+        <w:rPr>
+          <w:rFonts w:hint="eastAsia"/>
+        </w:rPr>
+        <w:t xml:space="preserve">结果令人不安。</w:t>
       </w:r>
     </w:p>
     <w:p>
@@ -509,24 +549,29 @@
       </w:pPr>
       <w:r>
         <w:rPr>
+          <w:rFonts w:hint="eastAsia"/>
+        </w:rPr>
+        <w:t xml:space="preserve">F1：</w:t>
+      </w:r>
+      <w:r>
+        <w:rPr>
+          <w:rFonts w:hint="eastAsia"/>
           <w:b/>
           <w:bCs/>
         </w:rPr>
-        <w:t xml:space="preserve">F1 —— </w:t>
-      </w:r>
-      <w:r>
-        <w:rPr>
-          <w:rFonts w:hint="eastAsia"/>
-          <w:b/>
-          <w:bCs/>
-        </w:rPr>
         <w:t xml:space="preserve">隐性误修复是默认行为，软提示只提供有限保护。</w:t>
       </w:r>
       <w:r>
         <w:rPr>
           <w:rFonts w:hint="eastAsia"/>
         </w:rPr>
-        <w:t xml:space="preserve">当真实目标元素被强制从候选集中移除时，朴素本地修复器（</w:t>
+        <w:t xml:space="preserve">真实目标元素一旦被强制从候选集中移除</w:t>
+      </w:r>
+      <w:r>
+        <w:rPr>
+          <w:rFonts w:hint="eastAsia"/>
+        </w:rPr>
+        <w:t xml:space="preserve">，朴素本地修复器（</w:t>
       </w:r>
       <w:r>
         <w:rPr>
@@ -653,17 +698,16 @@
       </w:pPr>
       <w:r>
         <w:rPr>
+          <w:rFonts w:hint="eastAsia"/>
+        </w:rPr>
+        <w:t xml:space="preserve">F2：</w:t>
+      </w:r>
+      <w:r>
+        <w:rPr>
+          <w:rFonts w:hint="eastAsia"/>
           <w:b/>
           <w:bCs/>
         </w:rPr>
-        <w:t xml:space="preserve">F2 —— </w:t>
-      </w:r>
-      <w:r>
-        <w:rPr>
-          <w:rFonts w:hint="eastAsia"/>
-          <w:b/>
-          <w:bCs/>
-        </w:rPr>
         <w:t xml:space="preserve">低开销确定性杠杆带来零回归的局部改进，但收益构成依赖模型。</w:t>
       </w:r>
       <w:r>
@@ -727,16 +771,25 @@
         <w:rPr>
           <w:rFonts w:hint="eastAsia"/>
         </w:rPr>
-        <w:t xml:space="preserve">77.3%（58/75）。testId</w:t>
-      </w:r>
-      <w:r>
-        <w:t xml:space="preserve"> </w:t>
-      </w:r>
-      <w:r>
-        <w:rPr>
-          <w:rFonts w:hint="eastAsia"/>
-        </w:rPr>
-        <w:t xml:space="preserve">加权检索与强锚点后置过滤经二因子析因分离后合计</w:t>
+        <w:t xml:space="preserve">77.3%（58/75）。</w:t>
+      </w:r>
+      <w:r>
+        <w:rPr>
+          <w:rFonts w:hint="eastAsia"/>
+        </w:rPr>
+        <w:t xml:space="preserve">Qwen 上 testId 加权检索与强锚点后置过滤经二因子析因分离后</w:t>
+      </w:r>
+      <w:r>
+        <w:rPr>
+          <w:rFonts w:hint="eastAsia"/>
+        </w:rPr>
+        <w:t xml:space="preserve"/>
+      </w:r>
+      <w:r>
+        <w:rPr>
+          <w:rFonts w:hint="eastAsia"/>
+        </w:rPr>
+        <w:t xml:space="preserve">合计</w:t>
       </w:r>
       <w:r>
         <w:t xml:space="preserve"> +3 </w:t>
@@ -771,16 +824,32 @@
         <w:rPr>
           <w:rFonts w:hint="eastAsia"/>
         </w:rPr>
-        <w:t xml:space="preserve">下</w:t>
-      </w:r>
-      <w:r>
-        <w:t xml:space="preserve"> McNemar </w:t>
-      </w:r>
-      <w:r>
-        <w:rPr>
-          <w:rFonts w:hint="eastAsia"/>
-        </w:rPr>
-        <w:t xml:space="preserve">未达显著，因此本文仅将其作为辅助性工程经验。</w:t>
+        <w:t xml:space="preserve">下 McNemar 未达显著。在 </w:t>
+      </w:r>
+      <w:r>
+        <w:rPr>
+          <w:rStyle w:val="VerbatimChar"/>
+          <w:rFonts w:hint="eastAsia"/>
+        </w:rPr>
+        <w:t xml:space="preserve">deepseek-v4-flash</w:t>
+      </w:r>
+      <w:r>
+        <w:rPr>
+          <w:rFonts w:hint="eastAsia"/>
+        </w:rPr>
+        <w:t xml:space="preserve"> 的 2×2 复现中，仅后置过滤保持 +4/-0 的零回归增益，testId 加权则为 +5/-5 的净零交换，说明该杠杆收益并非跨模型可加。本文因此仅将 F2 作为辅助性工程经验。</w:t>
+      </w:r>
+      <w:r>
+        <w:rPr>
+          <w:rFonts w:hint="eastAsia"/>
+        </w:rPr>
+        <w:t xml:space="preserve"/>
+      </w:r>
+      <w:r>
+        <w:rPr>
+          <w:rFonts w:hint="eastAsia"/>
+        </w:rPr>
+        <w:t xml:space="preserve"/>
       </w:r>
     </w:p>
     <w:p>
@@ -792,17 +861,16 @@
       </w:pPr>
       <w:r>
         <w:rPr>
+          <w:rFonts w:hint="eastAsia"/>
+        </w:rPr>
+        <w:t xml:space="preserve">F3：</w:t>
+      </w:r>
+      <w:r>
+        <w:rPr>
+          <w:rFonts w:hint="eastAsia"/>
           <w:b/>
           <w:bCs/>
         </w:rPr>
-        <w:t xml:space="preserve">F3 —— </w:t>
-      </w:r>
-      <w:r>
-        <w:rPr>
-          <w:rFonts w:hint="eastAsia"/>
-          <w:b/>
-          <w:bCs/>
-        </w:rPr>
         <w:t xml:space="preserve">跨应用泛化受锚点文化差异的制约。</w:t>
       </w:r>
       <w:r>
@@ -883,13 +951,16 @@
         <w:pStyle w:val="FirstParagraph"/>
       </w:pPr>
       <w:r>
-        <w:t xml:space="preserve">F1 </w:t>
-      </w:r>
-      <w:r>
-        <w:rPr>
-          <w:rFonts w:hint="eastAsia"/>
-        </w:rPr>
-        <w:t xml:space="preserve">为无人值守自愈流水线引入行为重放验证层提供了直接的经验性动机：即便更强模型能从软提示中获益，提示文本仍不足以成为可审计的安全边界。F3</w:t>
+        <w:rPr>
+          <w:rFonts w:hint="eastAsia"/>
+        </w:rPr>
+        <w:t xml:space="preserve">F1 为无人值守自愈流水线引入行为重放验证层提供了直接经验依据</w:t>
+      </w:r>
+      <w:r>
+        <w:rPr>
+          <w:rFonts w:hint="eastAsia"/>
+        </w:rPr>
+        <w:t xml:space="preserve">：即便更强模型能从软提示中获益，提示文本仍不足以成为可审计的安全边界。F3</w:t>
       </w:r>
       <w:r>
         <w:t xml:space="preserve"> </w:t>
@@ -951,7 +1022,7 @@
         <w:rPr>
           <w:rFonts w:hint="eastAsia"/>
         </w:rPr>
-        <w:t xml:space="preserve">此外，我们使用</w:t>
+        <w:t xml:space="preserve">本文还使用</w:t>
       </w:r>
       <w:r>
         <w:t xml:space="preserve"> HealReact </w:t>
@@ -1044,43 +1115,61 @@
         <w:rPr>
           <w:rFonts w:hint="eastAsia"/>
         </w:rPr>
-        <w:t xml:space="preserve">）。两个低开销确定性杠杆在 Qwen 上</w:t>
-      </w:r>
-      <w:r>
-        <w:t xml:space="preserve"> —— testId </w:t>
-      </w:r>
-      <w:r>
-        <w:rPr>
-          <w:rFonts w:hint="eastAsia"/>
-        </w:rPr>
-        <w:t xml:space="preserve">加权检索与强锚点后置过滤</w:t>
-      </w:r>
-      <w:r>
-        <w:t xml:space="preserve"> —— </w:t>
-      </w:r>
-      <w:r>
-        <w:rPr>
-          <w:rFonts w:hint="eastAsia"/>
-        </w:rPr>
-        <w:t xml:space="preserve">经二因子析因分离后合计</w:t>
-      </w:r>
-      <w:r>
-        <w:t xml:space="preserve"> 3 </w:t>
-      </w:r>
-      <w:r>
-        <w:rPr>
-          <w:rFonts w:hint="eastAsia"/>
-        </w:rPr>
-        <w:t xml:space="preserve">个新正确用例、零回归（方向一致，McNemar</w:t>
-      </w:r>
-      <w:r>
-        <w:t xml:space="preserve"> </w:t>
-      </w:r>
-      <w:r>
-        <w:rPr>
-          <w:rFonts w:hint="eastAsia"/>
-        </w:rPr>
-        <w:t xml:space="preserve">未达显著），表明确定性后处理可作为比提示工程更可审计的安全网。</w:t>
+        <w:t xml:space="preserve">）。</w:t>
+      </w:r>
+      <w:r>
+        <w:rPr>
+          <w:rFonts w:hint="eastAsia"/>
+        </w:rPr>
+        <w:t xml:space="preserve">两个低开销确定性杠杆（testId 加权检索与强锚点后置过滤）在 Qwen 上经二因子析因分离后合计 3 个新正确用例、零回归（方向一致，McNemar 未达显著）；DeepSeek 复现显示该增益主要来自后置过滤（+4/-0），加权检索未能复现净增益（+5/-5），表明确定性输出约束比候选重排更具跨模型可迁移性。</w:t>
+      </w:r>
+      <w:r>
+        <w:rPr>
+          <w:rFonts w:hint="eastAsia"/>
+        </w:rPr>
+        <w:t xml:space="preserve"/>
+      </w:r>
+      <w:r>
+        <w:rPr>
+          <w:rFonts w:hint="eastAsia"/>
+        </w:rPr>
+        <w:t xml:space="preserve"/>
+      </w:r>
+      <w:r>
+        <w:rPr>
+          <w:rFonts w:hint="eastAsia"/>
+        </w:rPr>
+        <w:t xml:space="preserve"/>
+      </w:r>
+      <w:r>
+        <w:rPr>
+          <w:rFonts w:hint="eastAsia"/>
+        </w:rPr>
+        <w:t xml:space="preserve"/>
+      </w:r>
+      <w:r>
+        <w:rPr>
+          <w:rFonts w:hint="eastAsia"/>
+        </w:rPr>
+        <w:t xml:space="preserve"/>
+      </w:r>
+      <w:r>
+        <w:rPr>
+          <w:rFonts w:hint="eastAsia"/>
+        </w:rPr>
+        <w:t xml:space="preserve"/>
+      </w:r>
+      <w:r>
+        <w:rPr>
+          <w:rFonts w:hint="eastAsia"/>
+        </w:rPr>
+        <w:t xml:space="preserve"/>
+      </w:r>
+      <w:r>
+        <w:rPr>
+          <w:rFonts w:hint="eastAsia"/>
+        </w:rPr>
+        <w:t xml:space="preserve"/>
       </w:r>
     </w:p>
     <w:bookmarkStart w:id="12" w:name="贡献"/>
@@ -1097,7 +1186,22 @@
         <w:pStyle w:val="FirstParagraph"/>
       </w:pPr>
       <w:r>
-        <w:t xml:space="preserve">（i）在真实 Playwright 数据集上对隐性误修复进行选择器层面的诊断性测量，并展示软提示放弃指令在本地 7B 模型上逐用例无效、在 gpt-4o 与 deepseek-v4-flash 上仍留下高比例误修复（§3）； （ii）使用 HealReact 的 L1/L3 静态基底作为可复现测量平台，而非声称已实现完整 L1–L4 自愈系统（§2）； （iii）给出两个辅助性工程观察：低开销确定性杠杆可带来零回归的局部改进但统计未显著，跨应用可达率受锚点文化差异显著制约（§3）。</w:t>
+        <w:rPr>
+          <w:rFonts w:hint="eastAsia"/>
+        </w:rPr>
+        <w:t xml:space="preserve">（i）在真实 Playwright 数据集上对隐性误修复进行选择器层面的诊断性测量，并展示软提示放弃指令在本地 7B 模型上逐用例无效、</w:t>
+      </w:r>
+      <w:r>
+        <w:rPr>
+          <w:rFonts w:hint="eastAsia"/>
+        </w:rPr>
+        <w:t xml:space="preserve">在两个 API 模型上仍留下高比例误修复</w:t>
+      </w:r>
+      <w:r>
+        <w:rPr>
+          <w:rFonts w:hint="eastAsia"/>
+        </w:rPr>
+        <w:t xml:space="preserve">（§3）； （ii）使用 HealReact 的 L1/L3 静态基底作为可复现测量平台，而非声称已实现完整 L1–L4 自愈系统（§2）； （iii）给出两个辅助性工程观察：低开销确定性杠杆可带来零回归的局部改进但统计未显著，跨应用可达率受锚点文化差异显著制约（§3）。</w:t>
       </w:r>
     </w:p>
     <w:p>
@@ -1280,7 +1384,13 @@
         <w:rPr>
           <w:rFonts w:hint="eastAsia"/>
         </w:rPr>
-        <w:t xml:space="preserve">的补丁被接受；自动程序修复综述为这一修复框架提供了相邻背景</w:t>
+        <w:t xml:space="preserve">的补丁被接受；</w:t>
+      </w:r>
+      <w:r>
+        <w:rPr>
+          <w:rFonts w:hint="eastAsia"/>
+        </w:rPr>
+        <w:t xml:space="preserve">自动程序修复综述提供了相关背景</w:t>
       </w:r>
       <w:r>
         <w:t xml:space="preserve"> </w:t>
@@ -1370,7 +1480,19 @@
         <w:rPr>
           <w:rFonts w:hint="eastAsia"/>
         </w:rPr>
-        <w:t xml:space="preserve">通过率，是确定性静态修复轴上最强的已发表基线，也是与本文</w:t>
+        <w:t xml:space="preserve">通过率，</w:t>
+      </w:r>
+      <w:r>
+        <w:rPr>
+          <w:rFonts w:hint="eastAsia"/>
+        </w:rPr>
+        <w:t xml:space="preserve">是确定性静态修复方向最强</w:t>
+      </w:r>
+      <w:r>
+        <w:rPr>
+          <w:rFonts w:hint="eastAsia"/>
+        </w:rPr>
+        <w:t xml:space="preserve">的已发表基线，也是与本文</w:t>
       </w:r>
       <w:r>
         <w:t xml:space="preserve"> L1 </w:t>
@@ -1379,16 +1501,25 @@
         <w:rPr>
           <w:rFonts w:hint="eastAsia"/>
         </w:rPr>
-        <w:t xml:space="preserve">基底最直接的比较对象。据本文检索范围，尚未见有同行评议的</w:t>
-      </w:r>
-      <w:r>
-        <w:t xml:space="preserve"> LLM </w:t>
-      </w:r>
-      <w:r>
-        <w:rPr>
-          <w:rFonts w:hint="eastAsia"/>
-        </w:rPr>
-        <w:t xml:space="preserve">定位器修复工具在真实</w:t>
+        <w:t xml:space="preserve">基底最直接的比较对象。</w:t>
+      </w:r>
+      <w:r>
+        <w:rPr>
+          <w:rFonts w:hint="eastAsia"/>
+        </w:rPr>
+        <w:t xml:space="preserve">据本文检索范围，尚无同行评议工作用 LLM 定位器修复工具</w:t>
+      </w:r>
+      <w:r>
+        <w:rPr>
+          <w:rFonts w:hint="eastAsia"/>
+        </w:rPr>
+        <w:t xml:space="preserve"/>
+      </w:r>
+      <w:r>
+        <w:rPr>
+          <w:rFonts w:hint="eastAsia"/>
+        </w:rPr>
+        <w:t xml:space="preserve">在真实</w:t>
       </w:r>
       <w:r>
         <w:t xml:space="preserve"> Playwright </w:t>
@@ -1415,7 +1546,34 @@
         <w:pStyle w:val="FirstParagraph"/>
       </w:pPr>
       <w:r>
-        <w:t xml:space="preserve">上述工作均未在真实基准数据集上隔离隐性误修复——即修复器给出语法通过、但指向错误元素的选择器、从而遮蔽真实 UI 变更的比率。Joseph 在一个右侧答案按构造一定可达的 demo 上报告了通过率；ReproBreak 提供了数据基底但未在其上评估任何修复器。§3 通过一个对抗性构造的探针填补这一空缺。</w:t>
+        <w:rPr>
+          <w:rFonts w:hint="eastAsia"/>
+        </w:rPr>
+        <w:t xml:space="preserve">上述工作均未在真实基准数据集上隔离隐性误修复</w:t>
+      </w:r>
+      <w:r>
+        <w:rPr>
+          <w:rFonts w:hint="eastAsia"/>
+        </w:rPr>
+        <w:t xml:space="preserve">，即修复器给出语法通过</w:t>
+      </w:r>
+      <w:r>
+        <w:rPr>
+          <w:rFonts w:hint="eastAsia"/>
+        </w:rPr>
+        <w:t xml:space="preserve">、但指向错误元素的选择器、从而遮蔽真实 UI 变更的比率。Joseph </w:t>
+      </w:r>
+      <w:r>
+        <w:rPr>
+          <w:rFonts w:hint="eastAsia"/>
+        </w:rPr>
+        <w:t xml:space="preserve">报告通过率所用的 demo 按构造保证正确答案一定可达</w:t>
+      </w:r>
+      <w:r>
+        <w:rPr>
+          <w:rFonts w:hint="eastAsia"/>
+        </w:rPr>
+        <w:t xml:space="preserve">；ReproBreak 提供了数据基底但未在其上评估任何修复器。§3 通过一个对抗性构造的探针填补这一空缺。</w:t>
       </w:r>
     </w:p>
     <w:bookmarkEnd w:id="16"/>
@@ -1433,7 +1591,22 @@
         <w:pStyle w:val="FirstParagraph"/>
       </w:pPr>
       <w:r>
-        <w:t xml:space="preserve">koenig-lexical [9,11] 是一个基于 React + Lexical 的现代富文本编辑器，其 Playwright 套件在很大程度上依赖自定义 data-kg-* 属性（约占其失效的一半），而非 data-testid。payloadcms/payload [12] 是一个 Next.js 后台 UI，其 CSS 类名遵循 BEM [13]，使用 ${baseClass}__suffix 模板字面量 —— 这些字面量对 React 可见，但对纯字面量的 AST 抽取器不可见。这两种锚点文化的对比是我们跨应用发现的依据（§3，F3）。</w:t>
+        <w:rPr>
+          <w:rFonts w:hint="eastAsia"/>
+        </w:rPr>
+        <w:t xml:space="preserve">koenig-lexical [9,11] 是一个基于 React + Lexical 的现代富文本编辑器，其 Playwright 套件在很大程度上依赖自定义 data-kg-* 属性（约占其失效的一半），而非 data-testid。payloadcms/payload [12] 是一个 Next.js 后台 UI，其 CSS 类名遵循 BEM [13]，使用 ${baseClass}__suffix </w:t>
+      </w:r>
+      <w:r>
+        <w:rPr>
+          <w:rFonts w:hint="eastAsia"/>
+        </w:rPr>
+        <w:t xml:space="preserve">模板字面量；这些字面量</w:t>
+      </w:r>
+      <w:r>
+        <w:rPr>
+          <w:rFonts w:hint="eastAsia"/>
+        </w:rPr>
+        <w:t xml:space="preserve">对 React 可见，但对纯字面量的 AST 抽取器不可见。这两种锚点文化的对比是我们跨应用发现的依据（§3，F3）。</w:t>
       </w:r>
     </w:p>
     <w:bookmarkEnd w:id="17"/>
@@ -1452,13 +1625,16 @@
         <w:pStyle w:val="FirstParagraph"/>
       </w:pPr>
       <w:r>
-        <w:t xml:space="preserve">HealReact </w:t>
-      </w:r>
-      <w:r>
-        <w:rPr>
-          <w:rFonts w:hint="eastAsia"/>
-        </w:rPr>
-        <w:t xml:space="preserve">设想为一条按</w:t>
+        <w:rPr>
+          <w:rFonts w:hint="eastAsia"/>
+        </w:rPr>
+        <w:t xml:space="preserve">本文把 HealReact 设想为一条按</w:t>
+      </w:r>
+      <w:r>
+        <w:rPr>
+          <w:rFonts w:hint="eastAsia"/>
+        </w:rPr>
+        <w:t xml:space="preserve"/>
       </w:r>
       <w:r>
         <w:rPr>
@@ -1490,7 +1666,19 @@
         <w:rPr>
           <w:rFonts w:hint="eastAsia"/>
         </w:rPr>
-        <w:t xml:space="preserve">递进的四层流水线（编号即由静态程度递减、行为验证程度递增的次序给出）：</w:t>
+        <w:t xml:space="preserve">递进的四层流水线</w:t>
+      </w:r>
+      <w:r>
+        <w:rPr>
+          <w:rFonts w:hint="eastAsia"/>
+        </w:rPr>
+        <w:t xml:space="preserve">（编号按静态程度递减、行为验证程度递增排列）</w:t>
+      </w:r>
+      <w:r>
+        <w:rPr>
+          <w:rFonts w:hint="eastAsia"/>
+        </w:rPr>
+        <w:t xml:space="preserve">：</w:t>
       </w:r>
       <w:r>
         <w:rPr>
@@ -1797,7 +1985,16 @@
         <w:pStyle w:val="ImageCaption"/>
       </w:pPr>
       <w:r>
-        <w:t xml:space="preserve">图 1 HealReact 诊断测量平台与未来流水线关系。L1（本文）是静态 AST 锚点基底，意图标注层在本文中仅在 32 元素的小规模构造样例（fixture）上评估；L3 是 §3 中评估的 LLM 修复器。L2（运行时 DOM 捕获）与 L4（行为重放验证器 / virtual oracle）以虚线框表示，二者在本文中均为设计占位、留作后续工作：L2 负责静态不可见的运行时元素，L4 的必要性由 §3 中的对抗性误修复探针在经验上得到充分动机化。</w:t>
+        <w:rPr>
+          <w:rFonts w:hint="eastAsia"/>
+        </w:rPr>
+        <w:t xml:space="preserve">图 1 HealReact 诊断测量平台与未来流水线关系。L1（本文）是静态 AST 锚点基底，意图标注层在本文中仅在 32 元素的小规模构造样例（fixture）上评估；L3 是 §3 中评估的 LLM 修复器。L2（运行时 DOM 捕获）与 L4（行为重放验证器 / virtual oracle）以虚线框表示，二者在本文中均为设计占位、留作后续工作：L2 负责静态不可见的运行时元素，</w:t>
+      </w:r>
+      <w:r>
+        <w:rPr>
+          <w:rFonts w:hint="eastAsia"/>
+        </w:rPr>
+        <w:t xml:space="preserve">L4 的必要性由 §3 中的对抗性误修复探针提供了直接经验依据。</w:t>
       </w:r>
     </w:p>
     <w:bookmarkEnd w:id="22"/>
@@ -1941,7 +2138,13 @@
         <w:rPr>
           <w:rFonts w:hint="eastAsia"/>
         </w:rPr>
-        <w:t xml:space="preserve">、自由文本内容，关键还包括</w:t>
+        <w:t xml:space="preserve">、自由文本内容，</w:t>
+      </w:r>
+      <w:r>
+        <w:rPr>
+          <w:rFonts w:hint="eastAsia"/>
+        </w:rPr>
+        <w:t xml:space="preserve">尤其包括任意自定义</w:t>
       </w:r>
       <w:r>
         <w:rPr>
@@ -1949,13 +2152,13 @@
           <w:i/>
           <w:iCs/>
         </w:rPr>
-        <w:t xml:space="preserve">任意</w:t>
-      </w:r>
-      <w:r>
-        <w:rPr>
-          <w:rFonts w:hint="eastAsia"/>
-        </w:rPr>
-        <w:t xml:space="preserve">自定义</w:t>
+        <w:t xml:space="preserve"/>
+      </w:r>
+      <w:r>
+        <w:rPr>
+          <w:rFonts w:hint="eastAsia"/>
+        </w:rPr>
+        <w:t xml:space="preserve"/>
       </w:r>
       <w:r>
         <w:t xml:space="preserve"> </w:t>
@@ -2075,16 +2278,25 @@
         <w:rPr>
           <w:rFonts w:hint="eastAsia"/>
         </w:rPr>
-        <w:t xml:space="preserve">元素都视为可交互</w:t>
-      </w:r>
-      <w:r>
-        <w:t xml:space="preserve"> —— </w:t>
-      </w:r>
-      <w:r>
-        <w:rPr>
-          <w:rFonts w:hint="eastAsia"/>
-        </w:rPr>
-        <w:t xml:space="preserve">而不仅是规范</w:t>
+        <w:t xml:space="preserve">元素都视为</w:t>
+      </w:r>
+      <w:r>
+        <w:rPr>
+          <w:rFonts w:hint="eastAsia"/>
+        </w:rPr>
+        <w:t xml:space="preserve">可交互，而不仅是</w:t>
+      </w:r>
+      <w:r>
+        <w:rPr>
+          <w:rFonts w:hint="eastAsia"/>
+        </w:rPr>
+        <w:t xml:space="preserve"/>
+      </w:r>
+      <w:r>
+        <w:rPr>
+          <w:rFonts w:hint="eastAsia"/>
+        </w:rPr>
+        <w:t xml:space="preserve">规范</w:t>
       </w:r>
       <w:r>
         <w:t xml:space="preserve"> HTML </w:t>
@@ -2192,7 +2404,22 @@
         <w:pStyle w:val="FirstParagraph"/>
       </w:pPr>
       <w:r>
-        <w:t xml:space="preserve">我们构建了一个 Playwright 选择器解析/匹配器，它接受任意选择器表达式（page.locator、getByTestId、getByRole、waitForSelector、原始 CSS）并返回它会匹配的 LocatorSheet 记录集。这是 §3 中每个论断被验证的透镜: 可达性是“断裂的选择器是否能解析到 sheet 中的某条记录？”；L3 正确性是“解析器是否把 LLM 提议的选择器与 ground truth 选择器映射到同一元素？”。构建这个透镜迫使我们处理引号感知的嵌套参数、动态 JS 表达式属性值、以及裸属性选择器；早期版本由于解析器 bug 把可达率虚抬到 85–98%，我们现在在诚实性审计中明确标注了这一点。</w:t>
+        <w:rPr>
+          <w:rFonts w:hint="eastAsia"/>
+        </w:rPr>
+        <w:t xml:space="preserve">我们构建了一个 Playwright 选择器解析/匹配器，它接受任意选择器表达式（page.locator、getByTestId、getByRole、waitForSelector、原始 CSS）并返回它会匹配的 LocatorSheet 记录集。这是 §3 中每个论断被验证的</w:t>
+      </w:r>
+      <w:r>
+        <w:rPr>
+          <w:rFonts w:hint="eastAsia"/>
+        </w:rPr>
+        <w:t xml:space="preserve">透镜：可达性是</w:t>
+      </w:r>
+      <w:r>
+        <w:rPr>
+          <w:rFonts w:hint="eastAsia"/>
+        </w:rPr>
+        <w:t xml:space="preserve">“断裂的选择器是否能解析到 sheet 中的某条记录？”；L3 正确性是“解析器是否把 LLM 提议的选择器与 ground truth 选择器映射到同一元素？”。构建这个透镜迫使我们处理引号感知的嵌套参数、动态 JS 表达式属性值、以及裸属性选择器；早期版本由于解析器 bug 把可达率虚抬到 85–98%，我们现在在诚实性审计中明确标注了这一点。</w:t>
       </w:r>
     </w:p>
     <w:bookmarkEnd w:id="25"/>
@@ -2521,25 +2748,31 @@
         <w:rPr>
           <w:rFonts w:hint="eastAsia"/>
         </w:rPr>
-        <w:t xml:space="preserve">上仅用</w:t>
-      </w:r>
-      <w:r>
-        <w:t xml:space="preserve"> Apple Metal </w:t>
-      </w:r>
-      <w:r>
-        <w:rPr>
-          <w:rFonts w:hint="eastAsia"/>
-        </w:rPr>
-        <w:t xml:space="preserve">加速的实际物理耗时约为</w:t>
-      </w:r>
-      <w:r>
-        <w:t xml:space="preserve"> 8 </w:t>
-      </w:r>
-      <w:r>
-        <w:rPr>
-          <w:rFonts w:hint="eastAsia"/>
-        </w:rPr>
-        <w:t xml:space="preserve">min；</w:t>
+        <w:t xml:space="preserve">上使用 Apple Metal 加速，实际耗时约 8 min</w:t>
+      </w:r>
+      <w:r>
+        <w:rPr>
+          <w:rFonts w:hint="eastAsia"/>
+        </w:rPr>
+        <w:t xml:space="preserve"/>
+      </w:r>
+      <w:r>
+        <w:rPr>
+          <w:rFonts w:hint="eastAsia"/>
+        </w:rPr>
+        <w:t xml:space="preserve"/>
+      </w:r>
+      <w:r>
+        <w:rPr>
+          <w:rFonts w:hint="eastAsia"/>
+        </w:rPr>
+        <w:t xml:space="preserve"/>
+      </w:r>
+      <w:r>
+        <w:rPr>
+          <w:rFonts w:hint="eastAsia"/>
+        </w:rPr>
+        <w:t xml:space="preserve">；</w:t>
       </w:r>
       <w:r>
         <w:rPr>
@@ -2563,7 +2796,13 @@
         <w:rPr>
           <w:rFonts w:hint="eastAsia"/>
         </w:rPr>
-        <w:t xml:space="preserve">兼容接口单独运行。</w:t>
+        <w:t xml:space="preserve">兼容</w:t>
+      </w:r>
+      <w:r>
+        <w:rPr>
+          <w:rFonts w:hint="eastAsia"/>
+        </w:rPr>
+        <w:t xml:space="preserve">接口单独运行，后者另完成 F2 的 2×2 四臂复现。</w:t>
       </w:r>
     </w:p>
     <w:bookmarkStart w:id="29" w:name="复现配置"/>
@@ -3086,10 +3325,19 @@
         <w:rPr>
           <w:rFonts w:hint="eastAsia"/>
         </w:rPr>
-        <w:t xml:space="preserve">。用户提示包含:</w:t>
-      </w:r>
-      <w:r>
-        <w:t xml:space="preserve"> (i) </w:t>
+        <w:t xml:space="preserve">。</w:t>
+      </w:r>
+      <w:r>
+        <w:rPr>
+          <w:rFonts w:hint="eastAsia"/>
+        </w:rPr>
+        <w:t xml:space="preserve">用户提示包含：(i)</w:t>
+      </w:r>
+      <w:r>
+        <w:rPr>
+          <w:rFonts w:hint="eastAsia"/>
+        </w:rPr>
+        <w:t xml:space="preserve"> </w:t>
       </w:r>
       <w:r>
         <w:rPr>
@@ -3234,16 +3482,25 @@
         <w:rPr>
           <w:rFonts w:hint="eastAsia"/>
         </w:rPr>
-        <w:t xml:space="preserve">）。模型必须给出三行:</w:t>
-      </w:r>
-      <w:r>
-        <w:t xml:space="preserve"> </w:t>
+        <w:t xml:space="preserve">）。</w:t>
+      </w:r>
+      <w:r>
+        <w:rPr>
+          <w:rFonts w:hint="eastAsia"/>
+        </w:rPr>
+        <w:t xml:space="preserve">模型必须给出三行：SELECTOR</w:t>
+      </w:r>
+      <w:r>
+        <w:rPr>
+          <w:rFonts w:hint="eastAsia"/>
+        </w:rPr>
+        <w:t xml:space="preserve"/>
       </w:r>
       <w:r>
         <w:rPr>
           <w:rStyle w:val="VerbatimChar"/>
         </w:rPr>
-        <w:t xml:space="preserve">SELECTOR</w:t>
+        <w:t xml:space="preserve"/>
       </w:r>
       <w:r>
         <w:t xml:space="preserve">、</w:t>
@@ -3267,25 +3524,31 @@
         <w:rPr>
           <w:rFonts w:hint="eastAsia"/>
         </w:rPr>
-        <w:t xml:space="preserve">（纯文本，非</w:t>
-      </w:r>
-      <w:r>
-        <w:t xml:space="preserve"> JSON: </w:t>
-      </w:r>
-      <w:r>
-        <w:rPr>
-          <w:rFonts w:hint="eastAsia"/>
-        </w:rPr>
-        <w:t xml:space="preserve">在模型反复在选择器中输出未转义引号后放弃了</w:t>
-      </w:r>
-      <w:r>
-        <w:t xml:space="preserve"> </w:t>
-      </w:r>
-      <w:r>
-        <w:rPr>
-          <w:rFonts w:hint="eastAsia"/>
-        </w:rPr>
-        <w:t xml:space="preserve">JSON）。解析器的多匹配冲突处理规则为：按</w:t>
+        <w:t xml:space="preserve">（纯文本，非 JSON：模型反复在选择器中输出未转义引号，因此放弃了 JSON）</w:t>
+      </w:r>
+      <w:r>
+        <w:rPr>
+          <w:rFonts w:hint="eastAsia"/>
+        </w:rPr>
+        <w:t xml:space="preserve"/>
+      </w:r>
+      <w:r>
+        <w:rPr>
+          <w:rFonts w:hint="eastAsia"/>
+        </w:rPr>
+        <w:t xml:space="preserve"/>
+      </w:r>
+      <w:r>
+        <w:rPr>
+          <w:rFonts w:hint="eastAsia"/>
+        </w:rPr>
+        <w:t xml:space="preserve"/>
+      </w:r>
+      <w:r>
+        <w:rPr>
+          <w:rFonts w:hint="eastAsia"/>
+        </w:rPr>
+        <w:t xml:space="preserve">。解析器的多匹配冲突处理规则为：按</w:t>
       </w:r>
       <w:r>
         <w:t xml:space="preserve"> </w:t>
@@ -3313,7 +3576,22 @@
         <w:pStyle w:val="Heading2"/>
       </w:pPr>
       <w:r>
-        <w:t xml:space="preserve">3.3F1: 目标缺失下的隐性误修复</w:t>
+        <w:rPr>
+          <w:rFonts w:hint="eastAsia"/>
+        </w:rPr>
+        <w:t xml:space="preserve">3.3</w:t>
+      </w:r>
+      <w:r>
+        <w:rPr>
+          <w:rFonts w:hint="eastAsia"/>
+        </w:rPr>
+        <w:t xml:space="preserve">F1：目标缺失</w:t>
+      </w:r>
+      <w:r>
+        <w:rPr>
+          <w:rFonts w:hint="eastAsia"/>
+        </w:rPr>
+        <w:t xml:space="preserve">下的隐性误修复</w:t>
       </w:r>
     </w:p>
     <w:bookmarkStart w:id="31" w:name="设置"/>
@@ -3438,7 +3716,19 @@
         <w:rPr>
           <w:rFonts w:hint="eastAsia"/>
         </w:rPr>
-        <w:t xml:space="preserve">，使模型在字面意义上无法选中正确答案。此时正确响应应当是放弃（</w:t>
+        <w:t xml:space="preserve">，</w:t>
+      </w:r>
+      <w:r>
+        <w:rPr>
+          <w:rFonts w:hint="eastAsia"/>
+        </w:rPr>
+        <w:t xml:space="preserve">使模型完全无法选中正确答案</w:t>
+      </w:r>
+      <w:r>
+        <w:rPr>
+          <w:rFonts w:hint="eastAsia"/>
+        </w:rPr>
+        <w:t xml:space="preserve">。此时正确响应应当是放弃（</w:t>
       </w:r>
       <w:r>
         <w:rPr>
@@ -3450,7 +3740,13 @@
         <w:rPr>
           <w:rFonts w:hint="eastAsia"/>
         </w:rPr>
-        <w:t xml:space="preserve">）；任何给出可解析选择器的响应都是一次会沉默地将测试改写到错误元素上的隐性误修复。</w:t>
+        <w:t xml:space="preserve">）；</w:t>
+      </w:r>
+      <w:r>
+        <w:rPr>
+          <w:rFonts w:hint="eastAsia"/>
+        </w:rPr>
+        <w:t xml:space="preserve">任何给出可解析选择器的响应，都会在不报错的情况下把测试改写到错误元素上，构成一次隐性误修复。</w:t>
       </w:r>
     </w:p>
     <w:p>
@@ -3461,7 +3757,7 @@
         <w:rPr>
           <w:rFonts w:hint="eastAsia"/>
         </w:rPr>
-        <w:t xml:space="preserve">我们比较两个提示变体:</w:t>
+        <w:t xml:space="preserve">我们比较两个提示变体：</w:t>
       </w:r>
     </w:p>
     <w:p>
@@ -3502,18 +3798,21 @@
       </w:pPr>
       <w:r>
         <w:rPr>
-          <w:smallCaps/>
-        </w:rPr>
-        <w:t xml:space="preserve">Abstain</w:t>
-      </w:r>
-      <w:r>
-        <w:t xml:space="preserve">: </w:t>
-      </w:r>
-      <w:r>
-        <w:rPr>
-          <w:rFonts w:hint="eastAsia"/>
-        </w:rPr>
-        <w:t xml:space="preserve">同一提示外加一条明确的</w:t>
+          <w:rFonts w:hint="eastAsia"/>
+        </w:rPr>
+        <w:t xml:space="preserve">Abstain：同一提示</w:t>
+      </w:r>
+      <w:r>
+        <w:rPr>
+          <w:rFonts w:hint="eastAsia"/>
+        </w:rPr>
+        <w:t xml:space="preserve"/>
+      </w:r>
+      <w:r>
+        <w:rPr>
+          <w:rFonts w:hint="eastAsia"/>
+        </w:rPr>
+        <w:t xml:space="preserve">外加一条明确的</w:t>
       </w:r>
       <w:r>
         <w:rPr>
@@ -5144,7 +5443,19 @@
         <w:rPr>
           <w:rFonts w:hint="eastAsia"/>
         </w:rPr>
-        <w:t xml:space="preserve">，作为一个粗略的风险估计、而非测量到的部署率（对抗性探针的行为不必一对一地迁移到真正只在运行时可达的用例上）。即便作为风险估计，我们仍认为这已经高到不能允许</w:t>
+        <w:t xml:space="preserve">，</w:t>
+      </w:r>
+      <w:r>
+        <w:rPr>
+          <w:rFonts w:hint="eastAsia"/>
+        </w:rPr>
+        <w:t xml:space="preserve">作为一个粗略的风险估计，而非测量到的部署率</w:t>
+      </w:r>
+      <w:r>
+        <w:rPr>
+          <w:rFonts w:hint="eastAsia"/>
+        </w:rPr>
+        <w:t xml:space="preserve">（对抗性探针的行为不必一对一地迁移到真正只在运行时可达的用例上）。即便作为风险估计，我们仍认为这已经高到不能允许</w:t>
       </w:r>
       <w:r>
         <w:t xml:space="preserve"> CI </w:t>
@@ -5173,7 +5484,13 @@
         <w:rPr>
           <w:rFonts w:hint="eastAsia"/>
         </w:rPr>
-        <w:t xml:space="preserve">Qwen 的 Vanilla 与 Abstain 等同性是更具诊断意义的发现，且这一等同性是逐用例成立的（表 2：75 个用例的配对判定无一发生改变）：一个 7B 规模的代码模型在该任务上不会因软提示式的守门规则而改变其可观察行为。两个 API 模型对照使结论更细化而非被推翻：GPT-4o 将 12 个误修复改为放弃（84.0%→68.0%，McNemar 精确检验 p=0.0005），DeepSeek 将 8 个误修复改为放弃、另有 1 个未解析转为误修复（80.0%→70.7%，p=0.039），说明更强的指令遵循能力确实能让放弃提示产生可观察效果。但二者在同一对抗性协议下仍分别有 51/75 与 53/75 的用例输出错误可解析选择器（68.0% 与 70.7%）。因而本文的强结论不是“所有模型必然忽视放弃提示”，而是：在缺乏外部确定性验证器时，仅凭提示文本无法作为可审计的安全边界；即便更强的 API 模型能部分响应放弃提示，仍需确定性拒绝机制或行为重放验证器来证明补丁没有错指。</w:t>
+        <w:t xml:space="preserve">Qwen 的 Vanilla 与 Abstain 等同性是更具诊断意义的发现，且这一等同性是逐用例成立的（表 2：75 个用例的配对判定无一发生改变）：一个 7B 规模的代码模型在该任务上不会因软提示式的守门规则而改变其可观察行为。两个 API 模型对照使结论更细化而非被推翻：GPT-4o 将 12 个误修复改为放弃（84.0%→68.0%，McNemar 精确检验 p=0.0005），DeepSeek 将 8 个误修复改为放弃、另有 1 个未解析转为误修复（80.0%→70.7%，p=0.039），说明更强的指令遵循能力确实能让放弃提示产生可观察效果。但二者在同一对抗性协议下仍分别有 51/75 与 53/75 的用例输出错误可解析选择器（68.0% 与 70.7%）。</w:t>
+      </w:r>
+      <w:r>
+        <w:rPr>
+          <w:rFonts w:hint="eastAsia"/>
+        </w:rPr>
+        <w:t xml:space="preserve">因此，本文的结论是，在缺乏外部确定性验证器时，仅凭提示文本无法成为可审计的安全边界。更强的 API 模型能部分响应放弃提示，但仍需确定性拒绝机制或行为重放验证器来证明补丁没有错指；这不同于“所有模型必然忽视放弃提示”的判断。</w:t>
       </w:r>
     </w:p>
     <w:bookmarkEnd w:id="35"/>
@@ -5822,7 +6139,13 @@
         <w:rPr>
           <w:rFonts w:hint="eastAsia"/>
         </w:rPr>
-        <w:t xml:space="preserve">两项手段均开销较低、完全确定性、无需任何模型再训练。借助表 5 的二因子析因可分离两者贡献：在 Qwen 上，以“两杠杆均关”为基线（55/75），单开 testId 加权检索与单开强锚点过滤各带来 +2 个精确匹配，两者全开合计 +3、且</w:t>
+        <w:t xml:space="preserve">两项手段开销都低，完全确定性，也不需要再训练模型。</w:t>
+      </w:r>
+      <w:r>
+        <w:rPr>
+          <w:rFonts w:hint="eastAsia"/>
+        </w:rPr>
+        <w:t xml:space="preserve">借助表 5 的二因子析因可分离两者贡献：在 Qwen 上，以“两杠杆均关”为基线（55/75），单开 testId 加权检索与单开强锚点过滤各带来 +2 个精确匹配，两者全开合计 +3、且</w:t>
       </w:r>
       <w:r>
         <w:rPr>
@@ -5912,7 +6235,19 @@
         <w:rPr>
           <w:rFonts w:hint="eastAsia"/>
         </w:rPr>
-        <w:t xml:space="preserve">）。一种解释是加权会重排候选顺序，从而改变生成式修复器的选择；当后置过滤已经剔除弱锚点候选时，这种重排不再带来稳定收益。该解释只是假设，本文未对候选顺序做受控消融。此外，API 服务端并不承诺逐位确定性，臂间 1–3 例的差异也可能混有运行间噪声。故我们不宣称确定性杠杆具有跨模型可加性：后置过滤作为不依赖模型偏好的输出约束更稳健，而加权检索的收益依赖底层模型与候选分布；所有差异均未达显著，以上仅作为工程线索。</w:t>
+        <w:t xml:space="preserve">）。一种解释是加权会重排候选顺序，从而改变生成式修复器的选择；</w:t>
+      </w:r>
+      <w:r>
+        <w:rPr>
+          <w:rFonts w:hint="eastAsia"/>
+        </w:rPr>
+        <w:t xml:space="preserve">后置过滤已经剔除弱锚点候选</w:t>
+      </w:r>
+      <w:r>
+        <w:rPr>
+          <w:rFonts w:hint="eastAsia"/>
+        </w:rPr>
+        <w:t xml:space="preserve">，这种重排不再带来稳定收益。该解释只是假设，本文未对候选顺序做受控消融。此外，API 服务端并不承诺逐位确定性，臂间 1–3 例的差异也可能混有运行间噪声。故我们不宣称确定性杠杆具有跨模型可加性：后置过滤作为不依赖模型偏好的输出约束更稳健，而加权检索的收益依赖底层模型与候选分布；所有差异均未达显著，以上仅作为工程线索。</w:t>
       </w:r>
     </w:p>
     <w:bookmarkEnd w:id="40"/>
@@ -5923,7 +6258,22 @@
         <w:pStyle w:val="Heading2"/>
       </w:pPr>
       <w:r>
-        <w:t xml:space="preserve">3.5F3: 跨应用泛化与 BEM 盲区</w:t>
+        <w:rPr>
+          <w:rFonts w:hint="eastAsia"/>
+        </w:rPr>
+        <w:t xml:space="preserve">3.5</w:t>
+      </w:r>
+      <w:r>
+        <w:rPr>
+          <w:rFonts w:hint="eastAsia"/>
+        </w:rPr>
+        <w:t xml:space="preserve">F3：跨应用泛化</w:t>
+      </w:r>
+      <w:r>
+        <w:rPr>
+          <w:rFonts w:hint="eastAsia"/>
+        </w:rPr>
+        <w:t xml:space="preserve">与 BEM 盲区</w:t>
       </w:r>
     </w:p>
     <w:bookmarkStart w:id="42" w:name="设置-2"/>
@@ -6187,16 +6537,25 @@
         <w:rPr>
           <w:vertAlign w:val="superscript"/>
         </w:rPr>
-        <w:t xml:space="preserve">[13]</w:t>
-      </w:r>
-      <w:r>
-        <w:t xml:space="preserve">: </w:t>
-      </w:r>
-      <w:r>
-        <w:rPr>
-          <w:rFonts w:hint="eastAsia"/>
-        </w:rPr>
-        <w:t xml:space="preserve">每个组件声明一个</w:t>
+        <w:t xml:space="preserve">[13</w:t>
+      </w:r>
+      <w:r>
+        <w:rPr>
+          <w:rFonts w:hint="eastAsia"/>
+        </w:rPr>
+        <w:t xml:space="preserve">]：每个组件</w:t>
+      </w:r>
+      <w:r>
+        <w:rPr>
+          <w:rFonts w:hint="eastAsia"/>
+        </w:rPr>
+        <w:t xml:space="preserve"/>
+      </w:r>
+      <w:r>
+        <w:rPr>
+          <w:rFonts w:hint="eastAsia"/>
+        </w:rPr>
+        <w:t xml:space="preserve">声明一个</w:t>
       </w:r>
       <w:r>
         <w:t xml:space="preserve"> </w:t>
@@ -6315,16 +6674,19 @@
         <w:rPr>
           <w:rFonts w:hint="eastAsia"/>
         </w:rPr>
-        <w:t xml:space="preserve">这一结果并非对</w:t>
-      </w:r>
-      <w:r>
-        <w:t xml:space="preserve"> HealReact L1 </w:t>
-      </w:r>
-      <w:r>
-        <w:rPr>
-          <w:rFonts w:hint="eastAsia"/>
-        </w:rPr>
-        <w:t xml:space="preserve">设计的否证，而是识别出一处范围明确的盲区，其修复对应一次确定性的</w:t>
+        <w:t xml:space="preserve">这一结果暴露了一处范围明确的盲区，并不构成对 HealReact L1 设计的否证</w:t>
+      </w:r>
+      <w:r>
+        <w:rPr>
+          <w:rFonts w:hint="eastAsia"/>
+        </w:rPr>
+        <w:t xml:space="preserve"/>
+      </w:r>
+      <w:r>
+        <w:rPr>
+          <w:rFonts w:hint="eastAsia"/>
+        </w:rPr>
+        <w:t xml:space="preserve">，其修复对应一次确定性的</w:t>
       </w:r>
       <w:r>
         <w:t xml:space="preserve"> AST </w:t>
@@ -6406,16 +6768,25 @@
         <w:rPr>
           <w:rFonts w:hint="eastAsia"/>
         </w:rPr>
-        <w:t xml:space="preserve">修复后原始可达率会显著抬升，但该结论尚属假设而非测量；对全部</w:t>
-      </w:r>
-      <w:r>
-        <w:t xml:space="preserve"> 307 </w:t>
-      </w:r>
-      <w:r>
-        <w:rPr>
-          <w:rFonts w:hint="eastAsia"/>
-        </w:rPr>
-        <w:t xml:space="preserve">个未命中用例做系统化的失因标注（BEM、CSS</w:t>
+        <w:t xml:space="preserve">修复后原始可达率会显著抬升，但该结论尚属假设而非测量；</w:t>
+      </w:r>
+      <w:r>
+        <w:rPr>
+          <w:rFonts w:hint="eastAsia"/>
+        </w:rPr>
+        <w:t xml:space="preserve">后续工作包括对全部 307 个未命中用例做系统化的失因标注（按 BEM、</w:t>
+      </w:r>
+      <w:r>
+        <w:rPr>
+          <w:rFonts w:hint="eastAsia"/>
+        </w:rPr>
+        <w:t xml:space="preserve"/>
+      </w:r>
+      <w:r>
+        <w:rPr>
+          <w:rFonts w:hint="eastAsia"/>
+        </w:rPr>
+        <w:t xml:space="preserve">CSS</w:t>
       </w:r>
       <w:r>
         <w:t xml:space="preserve"> </w:t>
@@ -6433,7 +6804,13 @@
         <w:rPr>
           <w:rFonts w:hint="eastAsia"/>
         </w:rPr>
-        <w:t xml:space="preserve">DOM、解析器局限等类别计数）、固定并记录</w:t>
+        <w:t xml:space="preserve">DOM、解析器局限</w:t>
+      </w:r>
+      <w:r>
+        <w:rPr>
+          <w:rFonts w:hint="eastAsia"/>
+        </w:rPr>
+        <w:t xml:space="preserve">等类别计数），固定并记录</w:t>
       </w:r>
       <w:r>
         <w:t xml:space="preserve"> payload </w:t>
@@ -6445,31 +6822,52 @@
         <w:t xml:space="preserve">的</w:t>
       </w:r>
       <w:r>
-        <w:t xml:space="preserve"> HEAD commit SHA </w:t>
-      </w:r>
-      <w:r>
-        <w:rPr>
-          <w:rFonts w:hint="eastAsia"/>
-        </w:rPr>
-        <w:t xml:space="preserve">以及与</w:t>
-      </w:r>
-      <w:r>
-        <w:t xml:space="preserve"> ReproBreak </w:t>
-      </w:r>
-      <w:r>
-        <w:rPr>
-          <w:rFonts w:hint="eastAsia"/>
-        </w:rPr>
-        <w:t xml:space="preserve">的逐</w:t>
-      </w:r>
-      <w:r>
-        <w:t xml:space="preserve"> commit </w:t>
-      </w:r>
-      <w:r>
-        <w:rPr>
-          <w:rFonts w:hint="eastAsia"/>
-        </w:rPr>
-        <w:t xml:space="preserve">配对对齐，均留作后续工作（当前冻结工件仅记录了</w:t>
+        <w:rPr>
+          <w:rFonts w:hint="eastAsia"/>
+        </w:rPr>
+        <w:t xml:space="preserve"> </w:t>
+      </w:r>
+      <w:r>
+        <w:rPr>
+          <w:rFonts w:hint="eastAsia"/>
+        </w:rPr>
+        <w:t xml:space="preserve">HEAD commit SHA，以及与 ReproBreak</w:t>
+      </w:r>
+      <w:r>
+        <w:rPr>
+          <w:rFonts w:hint="eastAsia"/>
+        </w:rPr>
+        <w:t xml:space="preserve"/>
+      </w:r>
+      <w:r>
+        <w:rPr>
+          <w:rFonts w:hint="eastAsia"/>
+        </w:rPr>
+        <w:t xml:space="preserve"> </w:t>
+      </w:r>
+      <w:r>
+        <w:rPr>
+          <w:rFonts w:hint="eastAsia"/>
+        </w:rPr>
+        <w:t xml:space="preserve">的</w:t>
+      </w:r>
+      <w:r>
+        <w:rPr>
+          <w:rFonts w:hint="eastAsia"/>
+        </w:rPr>
+        <w:t xml:space="preserve">逐 commit 配对对齐</w:t>
+      </w:r>
+      <w:r>
+        <w:rPr>
+          <w:rFonts w:hint="eastAsia"/>
+        </w:rPr>
+        <w:t xml:space="preserve"/>
+      </w:r>
+      <w:r>
+        <w:rPr>
+          <w:rFonts w:hint="eastAsia"/>
+        </w:rPr>
+        <w:t xml:space="preserve">（当前冻结工件仅记录了</w:t>
       </w:r>
       <w:r>
         <w:t xml:space="preserve"> payload </w:t>
@@ -6496,7 +6894,19 @@
         <w:rPr>
           <w:rFonts w:hint="eastAsia"/>
         </w:rPr>
-        <w:t xml:space="preserve">是当前抽取器下诚实的原始测量值。该发现真正的贡献是这条可证伪的跨应用泛化</w:t>
+        <w:t xml:space="preserve">是当前抽取器下诚实的原始测量值。</w:t>
+      </w:r>
+      <w:r>
+        <w:rPr>
+          <w:rFonts w:hint="eastAsia"/>
+        </w:rPr>
+        <w:t xml:space="preserve">该发现的主要贡献</w:t>
+      </w:r>
+      <w:r>
+        <w:rPr>
+          <w:rFonts w:hint="eastAsia"/>
+        </w:rPr>
+        <w:t xml:space="preserve">是这条可证伪的跨应用泛化</w:t>
       </w:r>
       <w:r>
         <w:rPr>
@@ -6638,31 +7048,37 @@
         <w:rPr>
           <w:rFonts w:hint="eastAsia"/>
         </w:rPr>
-        <w:t xml:space="preserve">断裂存在被朴素修复器静默改写到错误元素的风险。其危险并不在于</w:t>
-      </w:r>
-      <w:r>
-        <w:rPr>
-          <w:rFonts w:hint="eastAsia"/>
-        </w:rPr>
-        <w:t xml:space="preserve">“修复器让构建失败”</w:t>
-      </w:r>
-      <w:r>
-        <w:rPr>
-          <w:rFonts w:hint="eastAsia"/>
-        </w:rPr>
-        <w:t xml:space="preserve">——构建失败本就是测试应承担的职责——而在于</w:t>
-      </w:r>
-      <w:r>
-        <w:rPr>
-          <w:rFonts w:hint="eastAsia"/>
-        </w:rPr>
-        <w:t xml:space="preserve">“修复器使构建通过，但通过对的是错误的目标”</w:t>
-      </w:r>
-      <w:r>
-        <w:rPr>
-          <w:rFonts w:hint="eastAsia"/>
-        </w:rPr>
-        <w:t xml:space="preserve">。需再次强调，F1</w:t>
+        <w:t xml:space="preserve">断裂存在被朴素修复器静默改写到错误元素的风险。</w:t>
+      </w:r>
+      <w:r>
+        <w:rPr>
+          <w:rFonts w:hint="eastAsia"/>
+        </w:rPr>
+        <w:t xml:space="preserve">修复器让构建失败并不可怕，构建失败本就是测试应承担的职责；危险在于修复器使构建通过，但通过对的是错误的目标。</w:t>
+      </w:r>
+      <w:r>
+        <w:rPr>
+          <w:rFonts w:hint="eastAsia"/>
+        </w:rPr>
+        <w:t xml:space="preserve"/>
+      </w:r>
+      <w:r>
+        <w:rPr>
+          <w:rFonts w:hint="eastAsia"/>
+        </w:rPr>
+        <w:t xml:space="preserve"/>
+      </w:r>
+      <w:r>
+        <w:rPr>
+          <w:rFonts w:hint="eastAsia"/>
+        </w:rPr>
+        <w:t xml:space="preserve"/>
+      </w:r>
+      <w:r>
+        <w:rPr>
+          <w:rFonts w:hint="eastAsia"/>
+        </w:rPr>
+        <w:t xml:space="preserve">需再次强调，F1</w:t>
       </w:r>
       <w:r>
         <w:t xml:space="preserve"> </w:t>
@@ -6692,7 +7108,33 @@
         <w:rPr>
           <w:rFonts w:hint="eastAsia"/>
         </w:rPr>
-        <w:t xml:space="preserve">Qwen 的 Vanilla 与 Abstain 两种提示之间逐例完全等同（表 2），说明小型本地代码模型并未把“必要时放弃”的软指令转化为可观察行为。两个 API 模型的结果更复杂：放弃提示将 GPT-4o 的误修复从 63/75 降至 51/75（84.0%→68.0%），将 DeepSeek 的误修复从 60/75 降至 53/75（80.0%→70.7%），但残留误修复仍分别占 68.0% 与 70.7%。一种可能的解释是，软指令需与“生成合理输出”这一更强先验竞争，且模型越强越可能部分遵守该指令（此为机理层面的推测，本文未做训练动力学层面的验证）。对工具设计的启示仍然清晰：反误修复的安全保障必须可审计地置于模型之外，例如确定性的检索分数阈值、锚点类别归属规则，以及一个能够证伪通过补丁的行为验证器。</w:t>
+        <w:t xml:space="preserve">Qwen 的 Vanilla 与 Abstain 两种提示之间逐例完全等同（表 2），说明小型本地代码模型并未把“必要时放弃”的软指令转化为可观察行为。两个 API 模型的结果更复杂：放弃提示将 GPT-4o 的误修复从 63/75 降至 51/75（84.0%→68.0%），将 DeepSeek 的误修复从 60/75 降至 53/75（80.0%→70.7%），但残留误修复仍分别占 68.0% 与 70.7%。一种可能的解释是，软指令需与“生成合理输出”这一更强先验竞争，且模型越强越可能部分遵守该指令（此为机理层面的推测，本文未做训练动力学层面的验证）。对工具设计的启示仍然清晰：反误修复的安全保障</w:t>
+      </w:r>
+      <w:r>
+        <w:rPr>
+          <w:rFonts w:hint="eastAsia"/>
+        </w:rPr>
+        <w:t xml:space="preserve">必须放在模型</w:t>
+      </w:r>
+      <w:r>
+        <w:rPr>
+          <w:rFonts w:hint="eastAsia"/>
+          <w:i/>
+          <w:iCs/>
+        </w:rPr>
+        <w:t xml:space="preserve">之外</w:t>
+      </w:r>
+      <w:r>
+        <w:rPr>
+          <w:rFonts w:hint="eastAsia"/>
+        </w:rPr>
+        <w:t xml:space="preserve">，并且可以审计，例如确定性的</w:t>
+      </w:r>
+      <w:r>
+        <w:rPr>
+          <w:rFonts w:hint="eastAsia"/>
+        </w:rPr>
+        <w:t xml:space="preserve">检索分数阈值、锚点类别归属规则，以及一个能够证伪通过补丁的行为验证器。</w:t>
       </w:r>
     </w:p>
     <w:bookmarkEnd w:id="48"/>
@@ -6713,7 +7155,31 @@
         <w:rPr>
           <w:rFonts w:hint="eastAsia"/>
         </w:rPr>
-        <w:t xml:space="preserve">F2 不构成具有统计学显著性的性能结论。它在 Qwen 上给出一条低开销、零回归的工程线索：当系统知道某类锚点更稳定时，把约束放进候选检索与输出后置过滤，比只要求模型“优先考虑稳定锚点”更可审计。但 DeepSeek 的 2×2 复现只部分支持这一线索：强锚点后置过滤在两种模型上都保持零回归增益（Qwen +2/-0，DeepSeek +4/-0），而 testId 加权在 DeepSeek 上为 +5/-5 的净零交换，且与过滤同开时低于仅过滤。因此更稳妥的工程结论是：可审计的输出后置过滤比候选排序更具跨模型可迁移性；加权检索的收益依赖底层模型与候选分布。该解释仍属假设，本文未对候选顺序做受控消融，且所有差异均未达显著。本文据此把 F2 作为辅助性经验，而非主要科学贡献。</w:t>
+        <w:t xml:space="preserve">F2 不构成具有统计学显著性的性能结论。它在 Qwen 上给出一条低开销、零回归的工程线索：</w:t>
+      </w:r>
+      <w:r>
+        <w:rPr>
+          <w:rFonts w:hint="eastAsia"/>
+        </w:rPr>
+        <w:t xml:space="preserve">系统若知道某类锚点更稳定</w:t>
+      </w:r>
+      <w:r>
+        <w:rPr>
+          <w:rFonts w:hint="eastAsia"/>
+        </w:rPr>
+        <w:t xml:space="preserve">，把约束放进候选检索与输出后置过滤，比只要求模型“优先考虑稳定锚点”更可审计。但 DeepSeek 的 2×2 复现只部分支持这一线索：强锚点后置过滤在两种模型上都保持零回归增益（Qwen +2/-0，DeepSeek +4/-0），而 testId 加权在 DeepSeek 上为 +5/-5 的净零交换，且与过滤同开时低于仅过滤。因此更稳妥的</w:t>
+      </w:r>
+      <w:r>
+        <w:rPr>
+          <w:rFonts w:hint="eastAsia"/>
+        </w:rPr>
+        <w:t xml:space="preserve">工程结论是，可审计的</w:t>
+      </w:r>
+      <w:r>
+        <w:rPr>
+          <w:rFonts w:hint="eastAsia"/>
+        </w:rPr>
+        <w:t xml:space="preserve">输出后置过滤比候选排序更具跨模型可迁移性；加权检索的收益依赖底层模型与候选分布。该解释仍属假设，本文未对候选顺序做受控消融，且所有差异均未达显著。本文据此把 F2 作为辅助性经验，而非主要科学贡献。</w:t>
       </w:r>
     </w:p>
     <w:bookmarkEnd w:id="49"/>
@@ -6790,22 +7256,31 @@
         <w:rPr>
           <w:rFonts w:hint="eastAsia"/>
         </w:rPr>
-        <w:t xml:space="preserve">“软提示是否因小模型指令遵循不足而失效”</w:t>
-      </w:r>
-      <w:r>
-        <w:rPr>
-          <w:rFonts w:hint="eastAsia"/>
-        </w:rPr>
-        <w:t xml:space="preserve">：结果显示</w:t>
-      </w:r>
-      <w:r>
-        <w:t xml:space="preserve"> GPT-4o 与 DeepSeek </w:t>
-      </w:r>
-      <w:r>
-        <w:rPr>
-          <w:rFonts w:hint="eastAsia"/>
-        </w:rPr>
-        <w:t xml:space="preserve">分别能把误修复从</w:t>
+        <w:t xml:space="preserve">“软提示是否因小模型指令遵循不足而</w:t>
+      </w:r>
+      <w:r>
+        <w:rPr>
+          <w:rFonts w:hint="eastAsia"/>
+        </w:rPr>
+        <w:t xml:space="preserve">失效”。结果显示两个 API 模型分别把</w:t>
+      </w:r>
+      <w:r>
+        <w:rPr>
+          <w:rFonts w:hint="eastAsia"/>
+        </w:rPr>
+        <w:t xml:space="preserve"/>
+      </w:r>
+      <w:r>
+        <w:rPr>
+          <w:rFonts w:hint="eastAsia"/>
+        </w:rPr>
+        <w:t xml:space="preserve"/>
+      </w:r>
+      <w:r>
+        <w:rPr>
+          <w:rFonts w:hint="eastAsia"/>
+        </w:rPr>
+        <w:t xml:space="preserve">误修复从</w:t>
       </w:r>
       <w:r>
         <w:t xml:space="preserve"> 84.0% </w:t>
@@ -6964,7 +7439,13 @@
         <w:rPr>
           <w:rFonts w:hint="eastAsia"/>
         </w:rPr>
-        <w:t xml:space="preserve">作为最小可行性检查，我们对</w:t>
+        <w:t xml:space="preserve">作为最小规模的可行性检查</w:t>
+      </w:r>
+      <w:r>
+        <w:rPr>
+          <w:rFonts w:hint="eastAsia"/>
+        </w:rPr>
+        <w:t xml:space="preserve">，我们对</w:t>
       </w:r>
       <w:r>
         <w:t xml:space="preserve"> 3 </w:t>
@@ -7000,16 +7481,25 @@
         <w:rPr>
           <w:rFonts w:hint="eastAsia"/>
         </w:rPr>
-        <w:t xml:space="preserve">运行时重放：三者的修复后基线均通过；替换为</w:t>
-      </w:r>
-      <w:r>
-        <w:t xml:space="preserve"> HealReact </w:t>
-      </w:r>
-      <w:r>
-        <w:rPr>
-          <w:rFonts w:hint="eastAsia"/>
-        </w:rPr>
-        <w:t xml:space="preserve">提议选择器后，2/3</w:t>
+        <w:t xml:space="preserve">运行时重放：三者的修复后基线均通过；</w:t>
+      </w:r>
+      <w:r>
+        <w:rPr>
+          <w:rFonts w:hint="eastAsia"/>
+        </w:rPr>
+        <w:t xml:space="preserve">替换为 HealReact 提出的选择器后</w:t>
+      </w:r>
+      <w:r>
+        <w:rPr>
+          <w:rFonts w:hint="eastAsia"/>
+        </w:rPr>
+        <w:t xml:space="preserve"/>
+      </w:r>
+      <w:r>
+        <w:rPr>
+          <w:rFonts w:hint="eastAsia"/>
+        </w:rPr>
+        <w:t xml:space="preserve">，2/3</w:t>
       </w:r>
       <w:r>
         <w:t xml:space="preserve"> </w:t>
@@ -7318,16 +7808,25 @@
         <w:rPr>
           <w:rFonts w:hint="eastAsia"/>
         </w:rPr>
-        <w:t xml:space="preserve">个。对抽样用例用真实</w:t>
-      </w:r>
-      <w:r>
-        <w:t xml:space="preserve"> DOM </w:t>
-      </w:r>
-      <w:r>
-        <w:rPr>
-          <w:rFonts w:hint="eastAsia"/>
-        </w:rPr>
-        <w:t xml:space="preserve">快照交叉校验解析判定，仍留作后续工作。</w:t>
+        <w:t xml:space="preserve">个。</w:t>
+      </w:r>
+      <w:r>
+        <w:rPr>
+          <w:rFonts w:hint="eastAsia"/>
+        </w:rPr>
+        <w:t xml:space="preserve">用真实 DOM 快照交叉校验抽样用例的解析判定</w:t>
+      </w:r>
+      <w:r>
+        <w:rPr>
+          <w:rFonts w:hint="eastAsia"/>
+        </w:rPr>
+        <w:t xml:space="preserve"/>
+      </w:r>
+      <w:r>
+        <w:rPr>
+          <w:rFonts w:hint="eastAsia"/>
+        </w:rPr>
+        <w:t xml:space="preserve">，仍留作后续工作。</w:t>
       </w:r>
     </w:p>
     <w:bookmarkEnd w:id="51"/>
@@ -7511,7 +8010,43 @@
         <w:rPr>
           <w:rFonts w:hint="eastAsia"/>
         </w:rPr>
-        <w:t xml:space="preserve">77.3%；两个低开销确定性手段给出了统计未显著、且构成依赖底层模型的局部改进——强锚点后置过滤在 Qwen 与 DeepSeek 上均零回归，testId 加权则未在 DeepSeek 上复现净增益。三项结果合起来，为后续工作中评估行为重放验证器给出了直接的经验性动机，也给出了一条由锚点文化差异所限制的、可证伪的跨应用泛化假设。</w:t>
+        <w:t xml:space="preserve">77.3%；两个低开销确定性手段给出了统计未显著、且构成依赖底层模型的</w:t>
+      </w:r>
+      <w:r>
+        <w:rPr>
+          <w:rFonts w:hint="eastAsia"/>
+        </w:rPr>
+        <w:t xml:space="preserve">局部改进，其中强锚点后置过滤</w:t>
+      </w:r>
+      <w:r>
+        <w:rPr>
+          <w:rFonts w:hint="eastAsia"/>
+        </w:rPr>
+        <w:t xml:space="preserve">在 Qwen 与 DeepSeek 上均零回归，testId 加权则未在 DeepSeek 上复现净增益。</w:t>
+      </w:r>
+      <w:r>
+        <w:rPr>
+          <w:rFonts w:hint="eastAsia"/>
+        </w:rPr>
+        <w:t xml:space="preserve">三项结果共同为后续评估行为重放验证器提供了直接经验依据</w:t>
+      </w:r>
+      <w:r>
+        <w:rPr>
+          <w:rFonts w:hint="eastAsia"/>
+        </w:rPr>
+        <w:t xml:space="preserve">，</w:t>
+      </w:r>
+      <w:r>
+        <w:rPr>
+          <w:rFonts w:hint="eastAsia"/>
+        </w:rPr>
+        <w:t xml:space="preserve">也给出了一条受锚点文化差异限制、可证伪的</w:t>
+      </w:r>
+      <w:r>
+        <w:rPr>
+          <w:rFonts w:hint="eastAsia"/>
+        </w:rPr>
+        <w:t xml:space="preserve">跨应用泛化假设。</w:t>
       </w:r>
     </w:p>
     <w:bookmarkEnd w:id="54"/>

</xml_diff>